<commit_message>
docs(mcbukaf): konuşma notları 43 slayta güncellendi
10 yeni slayt için konuşma notları eklendi (eski 33 → 43):
- AI ile Oltalama (slayt 8) · Hangisi Phishing? Quiz (9)
- Crypto/Yatırım Dolandırıcılığı (18) · Thodex, Çiftlik Bank, deepfake reklam
- Wi-Fi Tuzağı (29) · SIM Swap (30) · IoT (31) · USB (32) · Malvertising (33)
- Hesabım Çalındı eylem planı (40) · Karar Senaryosu (41)

Süre tahmini: 35-45 dk → 45-55 dk.
Bölüm indeksleri SECTIONS ile senkronize edildi.
"Genel İpuçları" bölümü genişletildi (sık sorulan sorular: VPN dahil).

Çıktılar regenerate edildi:
- MCBÜKAF-2026-Konusma-Notlari.docx
- MCBÜKAF-2026-Konusma-Notlari.pdf

Co-Authored-By: Claude Opus 4.7 (1M context) <noreply@anthropic.com>
</commit_message>
<xml_diff>
--- a/src/presentations/mcbukaf-2026-siber/konusma-notlari/MCBÜKAF-2026-Konusma-Notlari.docx
+++ b/src/presentations/mcbukaf-2026-siber/konusma-notlari/MCBÜKAF-2026-Konusma-Notlari.docx
@@ -60,7 +60,7 @@
         </w:p>
       </w:sdtContent>
     </w:sdt>
-    <w:bookmarkStart w:id="49" w:name="sunum-notu"/>
+    <w:bookmarkStart w:id="59" w:name="sunum-notu"/>
     <w:p>
       <w:pPr>
         <w:pStyle w:val="Heading1"/>
@@ -84,7 +84,7 @@
           <w:b/>
           <w:bCs/>
         </w:rPr>
-        <w:t xml:space="preserve">33 slaytlık</w:t>
+        <w:t xml:space="preserve">43 slaytlık</w:t>
       </w:r>
       <w:r>
         <w:t xml:space="preserve"> </w:t>
@@ -138,7 +138,7 @@
           <w:b/>
           <w:bCs/>
         </w:rPr>
-        <w:t xml:space="preserve">35–45 dakika</w:t>
+        <w:t xml:space="preserve">45–55 dakika</w:t>
       </w:r>
       <w:r>
         <w:t xml:space="preserve">.</w:t>
@@ -285,7 +285,7 @@
         <w:t xml:space="preserve"> </w:t>
       </w:r>
       <w:r>
-        <w:t xml:space="preserve">canlı şifre deneyi (slayt 10), QR phishing tuzağı (slayt 25–26), şifre kırma animasyonu, deepfake video, fidye yazılımı geri sayımı.</w:t>
+        <w:t xml:space="preserve">canlı şifre deneyi (slayt 12), QR phishing tuzağı (slayt 33–34), şifre kırma animasyonu (11), deepfake video (26), fidye yazılımı geri sayımı (35), karar senaryosu (40).</w:t>
       </w:r>
     </w:p>
     <w:p>
@@ -429,7 +429,7 @@
         <w:t xml:space="preserve"> </w:t>
       </w:r>
       <w:r>
-        <w:t xml:space="preserve">Her sayıyı söylerken kart belirginleşir, biraz duraksa. Audience’ı sallamak için 45 saniye yeterli.</w:t>
+        <w:t xml:space="preserve">Her sayıyı söylerken kart belirginleşir, biraz duraksa. 45 saniye.</w:t>
       </w:r>
     </w:p>
     <w:p>
@@ -500,7 +500,7 @@
         <w:t xml:space="preserve"> </w:t>
       </w:r>
       <w:r>
-        <w:t xml:space="preserve">Audience’a 5 saniye bırak, ekrana bakmalarına izin ver — sayılar sokucu.</w:t>
+        <w:t xml:space="preserve">Audience’a 5 saniye bırak, ekrana bakmalarına izin ver.</w:t>
       </w:r>
     </w:p>
     <w:p>
@@ -512,7 +512,7 @@
     </w:p>
     <w:bookmarkEnd w:id="11"/>
     <w:bookmarkEnd w:id="12"/>
-    <w:bookmarkStart w:id="17" w:name="bölüm-2-oltalama-saldirilari"/>
+    <w:bookmarkStart w:id="19" w:name="bölüm-2-oltalama-saldirilari"/>
     <w:p>
       <w:pPr>
         <w:pStyle w:val="Heading2"/>
@@ -641,7 +641,7 @@
         <w:t xml:space="preserve"> </w:t>
       </w:r>
       <w:r>
-        <w:t xml:space="preserve">Kartlar sırayla parlar, her birini 5 saniye anlat. Toplam 60 saniye.</w:t>
+        <w:t xml:space="preserve">Kartlar sırayla parlar, her birini 5 saniye anlat.</w:t>
       </w:r>
     </w:p>
     <w:p>
@@ -682,7 +682,7 @@
         <w:t xml:space="preserve"> </w:t>
       </w:r>
       <w:r>
-        <w:t xml:space="preserve">gönderici. PTT, MNG, ARAS kişisel numaradan SMS atmaz — kısa, büyük harfli kurumsal kimlikten gelir.</w:t>
+        <w:t xml:space="preserve">gönderici. PTT, MNG, ARAS kişisel numaradan SMS atmaz.</w:t>
       </w:r>
       <w:r>
         <w:t xml:space="preserve"> </w:t>
@@ -698,7 +698,7 @@
         <w:t xml:space="preserve"> </w:t>
       </w:r>
       <w:r>
-        <w:t xml:space="preserve">link. ptt-tr-kargo.com gibi sahte alan adı, gerçeği ptt.gov.tr. bit.ly kısaltıcısı: nereye gittiğini gizler — resmi kurum kısaltıcı kullanmaz.</w:t>
+        <w:t xml:space="preserve">link. ptt-tr-kargo.com gibi sahte alan adı, gerçeği ptt.gov.tr.</w:t>
       </w:r>
       <w:r>
         <w:t xml:space="preserve"> </w:t>
@@ -748,7 +748,7 @@
         <w:t xml:space="preserve"> </w:t>
       </w:r>
       <w:r>
-        <w:t xml:space="preserve">Slayt 4 ipucu otomatik sırayla açılıyor (her 1.5 saniyede bir). Sen her açılınca onun üzerine konuş — 30 saniye/ipucu.</w:t>
+        <w:t xml:space="preserve">Slayt 4 ipucu otomatik sırayla açılıyor (her 1.5 sn). Her açılınca üzerine konuş.</w:t>
       </w:r>
     </w:p>
     <w:p>
@@ -789,17 +789,17 @@
         <w:t xml:space="preserve"> </w:t>
       </w:r>
       <w:r>
-        <w:t xml:space="preserve">Şirket önce 244 bin abone sızdı dedi — gerçek 2,8 milyon. CEO’nun erişim bilgileri bile dump’taydı. Şirketler yalan söylüyor.</w:t>
-      </w:r>
-      <w:r>
-        <w:t xml:space="preserve"> </w:t>
-      </w:r>
-      <w:r>
-        <w:rPr>
-          <w:b/>
-          <w:bCs/>
-        </w:rPr>
-        <w:t xml:space="preserve">İstanbul-İzmir savcılık çetesi 2025:</w:t>
+        <w:t xml:space="preserve">Şirket önce 244 bin abone sızdı dedi — gerçek 2,8 milyon. CEO’nun erişim bilgileri bile dump’taydı.</w:t>
+      </w:r>
+      <w:r>
+        <w:t xml:space="preserve"> </w:t>
+      </w:r>
+      <w:r>
+        <w:rPr>
+          <w:b/>
+          <w:bCs/>
+        </w:rPr>
+        <w:t xml:space="preserve">İstanbul-İzmir savcılık çetesi:</w:t>
       </w:r>
       <w:r>
         <w:t xml:space="preserve"> </w:t>
@@ -811,23 +811,11 @@
         <w:t xml:space="preserve"> </w:t>
       </w:r>
       <w:r>
-        <w:t xml:space="preserve">‘Adınız terör örgütüne karıştı’</w:t>
-      </w:r>
-      <w:r>
-        <w:t xml:space="preserve"> </w:t>
-      </w:r>
-      <w:r>
-        <w:t xml:space="preserve">repliği bu çetenin standart başlangıcı.</w:t>
-      </w:r>
-      <w:r>
-        <w:t xml:space="preserve"> </w:t>
-      </w:r>
-      <w:r>
-        <w:rPr>
-          <w:b/>
-          <w:bCs/>
-        </w:rPr>
-        <w:t xml:space="preserve">Haziran 2025’te 16 milyar parolanın yer aldığı dump:</w:t>
+        <w:rPr>
+          <w:b/>
+          <w:bCs/>
+        </w:rPr>
+        <w:t xml:space="preserve">Haziran 2025’te 16 milyar parolalık dump:</w:t>
       </w:r>
       <w:r>
         <w:t xml:space="preserve"> </w:t>
@@ -844,29 +832,13 @@
       </w:r>
     </w:p>
     <w:bookmarkEnd w:id="16"/>
-    <w:bookmarkEnd w:id="17"/>
-    <w:bookmarkStart w:id="24" w:name="bölüm-3-şifreler"/>
-    <w:p>
-      <w:pPr>
-        <w:pStyle w:val="Heading2"/>
-      </w:pPr>
-      <w:r>
-        <w:t xml:space="preserve">BÖLÜM 3 · ŞİFRELER</w:t>
-      </w:r>
-    </w:p>
-    <w:bookmarkStart w:id="18" w:name="slayt-8-bölüm-02-tek-şifre-domino"/>
+    <w:bookmarkStart w:id="17" w:name="Xe2c418e9c660a5938c375927d11d51f6b2e82d2"/>
     <w:p>
       <w:pPr>
         <w:pStyle w:val="Heading3"/>
       </w:pPr>
       <w:r>
-        <w:t xml:space="preserve">Slayt 8 · Bölüm 02 ·</w:t>
-      </w:r>
-      <w:r>
-        <w:t xml:space="preserve"> </w:t>
-      </w:r>
-      <w:r>
-        <w:t xml:space="preserve">“Tek şifre = domino”</w:t>
+        <w:t xml:space="preserve">Slayt 8 · AI ile Oltalama · 2026 Tehdidi (YENİ)</w:t>
       </w:r>
     </w:p>
     <w:p>
@@ -874,19 +846,85 @@
         <w:pStyle w:val="BlockText"/>
       </w:pPr>
       <w:r>
-        <w:t xml:space="preserve">“Birinden çalınırsa hepsi düşer. Birkaç rakam:</w:t>
-      </w:r>
-      <w:r>
-        <w:t xml:space="preserve"> </w:t>
-      </w:r>
-      <w:r>
-        <w:t xml:space="preserve">‘123456’</w:t>
-      </w:r>
-      <w:r>
-        <w:t xml:space="preserve"> </w:t>
-      </w:r>
-      <w:r>
-        <w:t xml:space="preserve">kırılma süresi 0,001 saniye. Kullanıcıların %83’ü aynı şifreyi birden çok yerde kullanıyor. Türkiye’de ortalama şifre uzunluğu sekiz karakter. 12 karışık karakter ise saldırgan için 3.000 yıl.”</w:t>
+        <w:t xml:space="preserve">“Eskiden phishing’i bozuk Türkçeden anlardık.</w:t>
+      </w:r>
+      <w:r>
+        <w:t xml:space="preserve"> </w:t>
+      </w:r>
+      <w:r>
+        <w:t xml:space="preserve">‘Sevgili müsteri, yüksek lisans bursu için tebrikler, lütfeb buraya tıklayınız’</w:t>
+      </w:r>
+      <w:r>
+        <w:t xml:space="preserve"> </w:t>
+      </w:r>
+      <w:r>
+        <w:t xml:space="preserve">— o gün geçti. Şimdi solda 2020 versiyonu, sağda 2026 versiyonu.</w:t>
+      </w:r>
+      <w:r>
+        <w:t xml:space="preserve"> </w:t>
+      </w:r>
+      <w:r>
+        <w:rPr>
+          <w:b/>
+          <w:bCs/>
+        </w:rPr>
+        <w:t xml:space="preserve">ChatGPT 5 saniyede kusursuz Türkçe üretiyor.</w:t>
+      </w:r>
+      <w:r>
+        <w:t xml:space="preserve"> </w:t>
+      </w:r>
+      <w:r>
+        <w:t xml:space="preserve">Üstelik sosyal medyandan toplanan veriyle e-posta</w:t>
+      </w:r>
+      <w:r>
+        <w:t xml:space="preserve"> </w:t>
+      </w:r>
+      <w:r>
+        <w:rPr>
+          <w:b/>
+          <w:bCs/>
+        </w:rPr>
+        <w:t xml:space="preserve">sana özel</w:t>
+      </w:r>
+      <w:r>
+        <w:t xml:space="preserve"> </w:t>
+      </w:r>
+      <w:r>
+        <w:t xml:space="preserve">hazırlanıyor — ismin, üniversiten, bölümün, hatta hocaların ismi. Artık yazımına değil,</w:t>
+      </w:r>
+      <w:r>
+        <w:t xml:space="preserve"> </w:t>
+      </w:r>
+      <w:r>
+        <w:rPr>
+          <w:b/>
+          <w:bCs/>
+        </w:rPr>
+        <w:t xml:space="preserve">isteğine</w:t>
+      </w:r>
+      <w:r>
+        <w:t xml:space="preserve"> </w:t>
+      </w:r>
+      <w:r>
+        <w:t xml:space="preserve">bak. Resmi kurum link tıklayıp şifre, IBAN ister mi? İstemez.”</w:t>
+      </w:r>
+    </w:p>
+    <w:p>
+      <w:pPr>
+        <w:pStyle w:val="FirstParagraph"/>
+      </w:pPr>
+      <w:r>
+        <w:rPr>
+          <w:b/>
+          <w:bCs/>
+        </w:rPr>
+        <w:t xml:space="preserve">Yapılacak:</w:t>
+      </w:r>
+      <w:r>
+        <w:t xml:space="preserve"> </w:t>
+      </w:r>
+      <w:r>
+        <w:t xml:space="preserve">İki kart yan yana, audience’a 10 saniye bırak. Sağdakini okusunlar.</w:t>
       </w:r>
     </w:p>
     <w:p>
@@ -896,14 +934,14 @@
         </w:pict>
       </w:r>
     </w:p>
-    <w:bookmarkEnd w:id="18"/>
-    <w:bookmarkStart w:id="19" w:name="slayt-9-trde-en-çok-kullanılan-şifreler"/>
+    <w:bookmarkEnd w:id="17"/>
+    <w:bookmarkStart w:id="18" w:name="slayt-9-hangisi-phishing-quiz-yeni"/>
     <w:p>
       <w:pPr>
         <w:pStyle w:val="Heading3"/>
       </w:pPr>
       <w:r>
-        <w:t xml:space="preserve">Slayt 9 · TR’de En Çok Kullanılan Şifreler</w:t>
+        <w:t xml:space="preserve">Slayt 9 · Hangisi Phishing? (Quiz) (YENİ)</w:t>
       </w:r>
     </w:p>
     <w:p>
@@ -911,85 +949,119 @@
         <w:pStyle w:val="BlockText"/>
       </w:pPr>
       <w:r>
-        <w:t xml:space="preserve">“Türkiye 2024–2025 listesi. Birinci</w:t>
-      </w:r>
-      <w:r>
-        <w:t xml:space="preserve"> </w:t>
-      </w:r>
-      <w:r>
-        <w:t xml:space="preserve">‘123456’</w:t>
-      </w:r>
-      <w:r>
-        <w:t xml:space="preserve">, sonra</w:t>
-      </w:r>
-      <w:r>
-        <w:t xml:space="preserve"> </w:t>
-      </w:r>
-      <w:r>
-        <w:t xml:space="preserve">‘123456789’</w:t>
-      </w:r>
-      <w:r>
-        <w:t xml:space="preserve">,</w:t>
-      </w:r>
-      <w:r>
-        <w:t xml:space="preserve"> </w:t>
-      </w:r>
-      <w:r>
-        <w:t xml:space="preserve">‘password’</w:t>
-      </w:r>
-      <w:r>
-        <w:t xml:space="preserve">,</w:t>
-      </w:r>
-      <w:r>
-        <w:t xml:space="preserve"> </w:t>
-      </w:r>
-      <w:r>
-        <w:t xml:space="preserve">‘qwerty’</w:t>
-      </w:r>
-      <w:r>
-        <w:t xml:space="preserve">,</w:t>
-      </w:r>
-      <w:r>
-        <w:t xml:space="preserve"> </w:t>
-      </w:r>
-      <w:r>
-        <w:t xml:space="preserve">‘111111’</w:t>
-      </w:r>
-      <w:r>
-        <w:t xml:space="preserve"> </w:t>
-      </w:r>
-      <w:r>
-        <w:t xml:space="preserve">— hepsi 1 saniyenin altında kırılıyor. Altıncı ve yedinci sıra:</w:t>
-      </w:r>
-      <w:r>
-        <w:t xml:space="preserve"> </w:t>
-      </w:r>
-      <w:r>
-        <w:t xml:space="preserve">‘fenerbahce’</w:t>
-      </w:r>
-      <w:r>
-        <w:t xml:space="preserve"> </w:t>
-      </w:r>
-      <w:r>
-        <w:t xml:space="preserve">ve</w:t>
-      </w:r>
-      <w:r>
-        <w:t xml:space="preserve"> </w:t>
-      </w:r>
-      <w:r>
-        <w:t xml:space="preserve">‘galatasaray’</w:t>
-      </w:r>
-      <w:r>
-        <w:t xml:space="preserve">. Sonra</w:t>
-      </w:r>
-      <w:r>
-        <w:t xml:space="preserve"> </w:t>
-      </w:r>
-      <w:r>
-        <w:t xml:space="preserve">‘ankara1453’</w:t>
-      </w:r>
-      <w:r>
-        <w:t xml:space="preserve">. Listedeki herkesin şifresi var mı? Bu liste her yıl güncellenir ve hep aynıdır.”</w:t>
+        <w:t xml:space="preserve">“Sıra sende. 4 e-posta var. Hangisi sahte? 4 saniyen var, içinden seç. … Şimdi cevaplar açılıyor:</w:t>
+      </w:r>
+      <w:r>
+        <w:t xml:space="preserve"> </w:t>
+      </w:r>
+      <w:r>
+        <w:t xml:space="preserve">‘no-reply@instagram.com’</w:t>
+      </w:r>
+      <w:r>
+        <w:t xml:space="preserve"> </w:t>
+      </w:r>
+      <w:r>
+        <w:t xml:space="preserve">gerçek — alan adı doğru.</w:t>
+      </w:r>
+      <w:r>
+        <w:t xml:space="preserve"> </w:t>
+      </w:r>
+      <w:r>
+        <w:t xml:space="preserve">‘destek@garanti-bbva-onay.com’</w:t>
+      </w:r>
+      <w:r>
+        <w:t xml:space="preserve"> </w:t>
+      </w:r>
+      <w:r>
+        <w:t xml:space="preserve">sahte — Garanti’nin alan adı garantibbva.com.tr,</w:t>
+      </w:r>
+      <w:r>
+        <w:t xml:space="preserve"> </w:t>
+      </w:r>
+      <w:r>
+        <w:t xml:space="preserve">‘-onay.com’</w:t>
+      </w:r>
+      <w:r>
+        <w:t xml:space="preserve"> </w:t>
+      </w:r>
+      <w:r>
+        <w:t xml:space="preserve">uydurma.</w:t>
+      </w:r>
+      <w:r>
+        <w:t xml:space="preserve"> </w:t>
+      </w:r>
+      <w:r>
+        <w:t xml:space="preserve">‘bilgi@yok.gov.tr’</w:t>
+      </w:r>
+      <w:r>
+        <w:t xml:space="preserve"> </w:t>
+      </w:r>
+      <w:r>
+        <w:t xml:space="preserve">gerçek — .gov.tr resmî.</w:t>
+      </w:r>
+      <w:r>
+        <w:t xml:space="preserve"> </w:t>
+      </w:r>
+      <w:r>
+        <w:t xml:space="preserve">‘ceo@turknet-finans-acil.com’</w:t>
+      </w:r>
+      <w:r>
+        <w:t xml:space="preserve"> </w:t>
+      </w:r>
+      <w:r>
+        <w:t xml:space="preserve">sahte — gerçek alan turknet.com.tr,</w:t>
+      </w:r>
+      <w:r>
+        <w:t xml:space="preserve"> </w:t>
+      </w:r>
+      <w:r>
+        <w:t xml:space="preserve">‘finans-acil’</w:t>
+      </w:r>
+      <w:r>
+        <w:t xml:space="preserve"> </w:t>
+      </w:r>
+      <w:r>
+        <w:t xml:space="preserve">eklentisi tipik whaling kalıbı.</w:t>
+      </w:r>
+      <w:r>
+        <w:t xml:space="preserve"> </w:t>
+      </w:r>
+      <w:r>
+        <w:rPr>
+          <w:b/>
+          <w:bCs/>
+        </w:rPr>
+        <w:t xml:space="preserve">Mantık:</w:t>
+      </w:r>
+      <w:r>
+        <w:t xml:space="preserve"> </w:t>
+      </w:r>
+      <w:r>
+        <w:t xml:space="preserve">alan adının kök kısmı her zaman sağda,</w:t>
+      </w:r>
+      <w:r>
+        <w:t xml:space="preserve"> </w:t>
+      </w:r>
+      <w:r>
+        <w:t xml:space="preserve">‘.com’</w:t>
+      </w:r>
+      <w:r>
+        <w:t xml:space="preserve"> </w:t>
+      </w:r>
+      <w:r>
+        <w:t xml:space="preserve">veya</w:t>
+      </w:r>
+      <w:r>
+        <w:t xml:space="preserve"> </w:t>
+      </w:r>
+      <w:r>
+        <w:t xml:space="preserve">‘.gov.tr’</w:t>
+      </w:r>
+      <w:r>
+        <w:t xml:space="preserve"> </w:t>
+      </w:r>
+      <w:r>
+        <w:t xml:space="preserve">hemen önce.”</w:t>
       </w:r>
     </w:p>
     <w:p>
@@ -1007,19 +1079,7 @@
         <w:t xml:space="preserve"> </w:t>
       </w:r>
       <w:r>
-        <w:t xml:space="preserve">Audience’a 5 saniye sus — listeyi okusunlar. Birkaç kişinin yüzünde</w:t>
-      </w:r>
-      <w:r>
-        <w:t xml:space="preserve"> </w:t>
-      </w:r>
-      <w:r>
-        <w:t xml:space="preserve">‘eyvah’</w:t>
-      </w:r>
-      <w:r>
-        <w:t xml:space="preserve"> </w:t>
-      </w:r>
-      <w:r>
-        <w:t xml:space="preserve">ifadesi göreceksin.</w:t>
+        <w:t xml:space="preserve">İlk 4 sn audience’a sus, tahmin etsinler. Reveal sonrası 3 sn daha.</w:t>
       </w:r>
     </w:p>
     <w:p>
@@ -1029,14 +1089,30 @@
         </w:pict>
       </w:r>
     </w:p>
+    <w:bookmarkEnd w:id="18"/>
     <w:bookmarkEnd w:id="19"/>
-    <w:bookmarkStart w:id="20" w:name="slayt-10-şifre-kırma-animasyonu"/>
+    <w:bookmarkStart w:id="26" w:name="bölüm-3-şifreler"/>
+    <w:p>
+      <w:pPr>
+        <w:pStyle w:val="Heading2"/>
+      </w:pPr>
+      <w:r>
+        <w:t xml:space="preserve">BÖLÜM 3 · ŞİFRELER</w:t>
+      </w:r>
+    </w:p>
+    <w:bookmarkStart w:id="20" w:name="slayt-10-bölüm-02-tek-şifre-domino"/>
     <w:p>
       <w:pPr>
         <w:pStyle w:val="Heading3"/>
       </w:pPr>
       <w:r>
-        <w:t xml:space="preserve">Slayt 10 · Şifre Kırma Animasyonu</w:t>
+        <w:t xml:space="preserve">Slayt 10 · Bölüm 02 ·</w:t>
+      </w:r>
+      <w:r>
+        <w:t xml:space="preserve"> </w:t>
+      </w:r>
+      <w:r>
+        <w:t xml:space="preserve">“Tek şifre = domino”</w:t>
       </w:r>
     </w:p>
     <w:p>
@@ -1044,117 +1120,19 @@
         <w:pStyle w:val="BlockText"/>
       </w:pPr>
       <w:r>
-        <w:t xml:space="preserve">“Beş örnek şifreyi sırayla saldırgana veriyoruz.</w:t>
-      </w:r>
-      <w:r>
-        <w:t xml:space="preserve"> </w:t>
-      </w:r>
-      <w:r>
-        <w:rPr>
-          <w:b/>
-          <w:bCs/>
-        </w:rPr>
+        <w:t xml:space="preserve">“Birinden çalınırsa hepsi düşer. Birkaç rakam:</w:t>
+      </w:r>
+      <w:r>
+        <w:t xml:space="preserve"> </w:t>
+      </w:r>
+      <w:r>
         <w:t xml:space="preserve">‘123456’</w:t>
       </w:r>
       <w:r>
         <w:t xml:space="preserve"> </w:t>
       </w:r>
       <w:r>
-        <w:t xml:space="preserve">— anında kırıldı.</w:t>
-      </w:r>
-      <w:r>
-        <w:t xml:space="preserve"> </w:t>
-      </w:r>
-      <w:r>
-        <w:rPr>
-          <w:b/>
-          <w:bCs/>
-        </w:rPr>
-        <w:t xml:space="preserve">‘ankara06’</w:t>
-      </w:r>
-      <w:r>
-        <w:t xml:space="preserve"> </w:t>
-      </w:r>
-      <w:r>
-        <w:t xml:space="preserve">— 0,3 saniye, yarım nefes.</w:t>
-      </w:r>
-      <w:r>
-        <w:t xml:space="preserve"> </w:t>
-      </w:r>
-      <w:r>
-        <w:rPr>
-          <w:b/>
-          <w:bCs/>
-        </w:rPr>
-        <w:t xml:space="preserve">‘Kalem42!’</w:t>
-      </w:r>
-      <w:r>
-        <w:t xml:space="preserve"> </w:t>
-      </w:r>
-      <w:r>
-        <w:t xml:space="preserve">— yedi dakika, bir kahve molası.</w:t>
-      </w:r>
-      <w:r>
-        <w:t xml:space="preserve"> </w:t>
-      </w:r>
-      <w:r>
-        <w:rPr>
-          <w:b/>
-          <w:bCs/>
-        </w:rPr>
-        <w:t xml:space="preserve">12 karışık karakter</w:t>
-      </w:r>
-      <w:r>
-        <w:t xml:space="preserve"> </w:t>
-      </w:r>
-      <w:r>
-        <w:t xml:space="preserve">— 3.000 yıl, saldırgan vazgeçer.</w:t>
-      </w:r>
-      <w:r>
-        <w:t xml:space="preserve"> </w:t>
-      </w:r>
-      <w:r>
-        <w:rPr>
-          <w:b/>
-          <w:bCs/>
-        </w:rPr>
-        <w:t xml:space="preserve">Cümle şifre</w:t>
-      </w:r>
-      <w:r>
-        <w:t xml:space="preserve"> </w:t>
-      </w:r>
-      <w:r>
-        <w:t xml:space="preserve">—</w:t>
-      </w:r>
-      <w:r>
-        <w:t xml:space="preserve"> </w:t>
-      </w:r>
-      <w:r>
-        <w:t xml:space="preserve">‘Manisa-uzumleri-2026!’</w:t>
-      </w:r>
-      <w:r>
-        <w:t xml:space="preserve"> </w:t>
-      </w:r>
-      <w:r>
-        <w:t xml:space="preserve">— sonsuz, kırılmaz. Fark ettiniz mi? Uzunluk + farklı karakter = bambaşka bir oyun.”</w:t>
-      </w:r>
-    </w:p>
-    <w:p>
-      <w:pPr>
-        <w:pStyle w:val="FirstParagraph"/>
-      </w:pPr>
-      <w:r>
-        <w:rPr>
-          <w:b/>
-          <w:bCs/>
-        </w:rPr>
-        <w:t xml:space="preserve">Yapılacak:</w:t>
-      </w:r>
-      <w:r>
-        <w:t xml:space="preserve"> </w:t>
-      </w:r>
-      <w:r>
-        <w:t xml:space="preserve">Animasyon ~30 saniye, kendi başına oynar. Sen her ekran değişiminde tek cümle söyle.</w:t>
+        <w:t xml:space="preserve">kırılma süresi 0,001 saniye. Kullanıcıların %83’ü aynı şifreyi birden çok yerde kullanıyor. Türkiye’de ortalama şifre uzunluğu sekiz karakter. 12 karışık karakter ise saldırgan için 3.000 yıl.”</w:t>
       </w:r>
     </w:p>
     <w:p>
@@ -1165,13 +1143,13 @@
       </w:r>
     </w:p>
     <w:bookmarkEnd w:id="20"/>
-    <w:bookmarkStart w:id="21" w:name="X32d480b588431982f9e4bc0a978c650b4562106"/>
+    <w:bookmarkStart w:id="21" w:name="slayt-11-trde-en-çok-kullanılan-şifreler"/>
     <w:p>
       <w:pPr>
         <w:pStyle w:val="Heading3"/>
       </w:pPr>
       <w:r>
-        <w:t xml:space="preserve">Slayt 11 · CANLI DENEY · Telefonunla Şifre Test Et</w:t>
+        <w:t xml:space="preserve">Slayt 11 · TR’de En Çok Kullanılan Şifreler</w:t>
       </w:r>
     </w:p>
     <w:p>
@@ -1179,35 +1157,85 @@
         <w:pStyle w:val="BlockText"/>
       </w:pPr>
       <w:r>
-        <w:t xml:space="preserve">“Şimdi sıra sende. QR’ı tarat, kendi kullandığın bir şifreyi yaz — endişelenme,</w:t>
-      </w:r>
-      <w:r>
-        <w:t xml:space="preserve"> </w:t>
-      </w:r>
-      <w:r>
-        <w:rPr>
-          <w:b/>
-          <w:bCs/>
-        </w:rPr>
-        <w:t xml:space="preserve">gerçek şifre ekrana yansımıyor</w:t>
-      </w:r>
-      <w:r>
-        <w:t xml:space="preserve"> </w:t>
-      </w:r>
-      <w:r>
-        <w:t xml:space="preserve">— sadece uzunluğu, gücü ve sızıntıda olup olmadığı yansıyor.</w:t>
-      </w:r>
-      <w:r>
-        <w:t xml:space="preserve"> </w:t>
-      </w:r>
-      <w:r>
-        <w:t xml:space="preserve">‘Sonucu ekrana yansıt’</w:t>
-      </w:r>
-      <w:r>
-        <w:t xml:space="preserve"> </w:t>
-      </w:r>
-      <w:r>
-        <w:t xml:space="preserve">butonuna bas. Bekleyelim.”</w:t>
+        <w:t xml:space="preserve">“Türkiye 2024–2025 listesi. Birinci</w:t>
+      </w:r>
+      <w:r>
+        <w:t xml:space="preserve"> </w:t>
+      </w:r>
+      <w:r>
+        <w:t xml:space="preserve">‘123456’</w:t>
+      </w:r>
+      <w:r>
+        <w:t xml:space="preserve">, sonra</w:t>
+      </w:r>
+      <w:r>
+        <w:t xml:space="preserve"> </w:t>
+      </w:r>
+      <w:r>
+        <w:t xml:space="preserve">‘123456789’</w:t>
+      </w:r>
+      <w:r>
+        <w:t xml:space="preserve">,</w:t>
+      </w:r>
+      <w:r>
+        <w:t xml:space="preserve"> </w:t>
+      </w:r>
+      <w:r>
+        <w:t xml:space="preserve">‘password’</w:t>
+      </w:r>
+      <w:r>
+        <w:t xml:space="preserve">,</w:t>
+      </w:r>
+      <w:r>
+        <w:t xml:space="preserve"> </w:t>
+      </w:r>
+      <w:r>
+        <w:t xml:space="preserve">‘qwerty’</w:t>
+      </w:r>
+      <w:r>
+        <w:t xml:space="preserve">,</w:t>
+      </w:r>
+      <w:r>
+        <w:t xml:space="preserve"> </w:t>
+      </w:r>
+      <w:r>
+        <w:t xml:space="preserve">‘111111’</w:t>
+      </w:r>
+      <w:r>
+        <w:t xml:space="preserve"> </w:t>
+      </w:r>
+      <w:r>
+        <w:t xml:space="preserve">— hepsi 1 saniyenin altında. Altıncı ve yedinci sıra:</w:t>
+      </w:r>
+      <w:r>
+        <w:t xml:space="preserve"> </w:t>
+      </w:r>
+      <w:r>
+        <w:t xml:space="preserve">‘fenerbahce’</w:t>
+      </w:r>
+      <w:r>
+        <w:t xml:space="preserve"> </w:t>
+      </w:r>
+      <w:r>
+        <w:t xml:space="preserve">ve</w:t>
+      </w:r>
+      <w:r>
+        <w:t xml:space="preserve"> </w:t>
+      </w:r>
+      <w:r>
+        <w:t xml:space="preserve">‘galatasaray’</w:t>
+      </w:r>
+      <w:r>
+        <w:t xml:space="preserve">. Sonra</w:t>
+      </w:r>
+      <w:r>
+        <w:t xml:space="preserve"> </w:t>
+      </w:r>
+      <w:r>
+        <w:t xml:space="preserve">‘ankara1453’</w:t>
+      </w:r>
+      <w:r>
+        <w:t xml:space="preserve">. Listedeki herkesin şifresi var mı?”</w:t>
       </w:r>
     </w:p>
     <w:p>
@@ -1225,51 +1253,19 @@
         <w:t xml:space="preserve"> </w:t>
       </w:r>
       <w:r>
-        <w:t xml:space="preserve">İlk testin gelmesini bekle (10–20 saniye). Boşluğa basınca</w:t>
-      </w:r>
-      <w:r>
-        <w:t xml:space="preserve"> </w:t>
-      </w:r>
-      <w:r>
-        <w:rPr>
-          <w:b/>
-          <w:bCs/>
-        </w:rPr>
-        <w:t xml:space="preserve">reveal fazı</w:t>
-      </w:r>
-      <w:r>
-        <w:t xml:space="preserve"> </w:t>
-      </w:r>
-      <w:r>
-        <w:t xml:space="preserve">açılır — salondaki şifrelerin parmak izleri akmaya başlar.</w:t>
-      </w:r>
-      <w:r>
-        <w:t xml:space="preserve"> </w:t>
-      </w:r>
-      <w:r>
-        <w:t xml:space="preserve">“İşte bunlar sizin şifreleriniz — gerçek phishing sayfası şifrenin</w:t>
-      </w:r>
-      <w:r>
-        <w:t xml:space="preserve"> </w:t>
-      </w:r>
-      <w:r>
-        <w:rPr>
-          <w:b/>
-          <w:bCs/>
-        </w:rPr>
-        <w:t xml:space="preserve">kendisini</w:t>
-      </w:r>
-      <w:r>
-        <w:t xml:space="preserve"> </w:t>
-      </w:r>
-      <w:r>
-        <w:t xml:space="preserve">de alır”</w:t>
-      </w:r>
-      <w:r>
-        <w:t xml:space="preserve"> </w:t>
-      </w:r>
-      <w:r>
-        <w:t xml:space="preserve">de.</w:t>
+        <w:t xml:space="preserve">5 saniye sus. Birkaç kişinin yüzünde</w:t>
+      </w:r>
+      <w:r>
+        <w:t xml:space="preserve"> </w:t>
+      </w:r>
+      <w:r>
+        <w:t xml:space="preserve">‘eyvah’</w:t>
+      </w:r>
+      <w:r>
+        <w:t xml:space="preserve"> </w:t>
+      </w:r>
+      <w:r>
+        <w:t xml:space="preserve">ifadesi göreceksin.</w:t>
       </w:r>
     </w:p>
     <w:p>
@@ -1280,19 +1276,13 @@
       </w:r>
     </w:p>
     <w:bookmarkEnd w:id="21"/>
-    <w:bookmarkStart w:id="22" w:name="X0d8ec8f64d45f85c104bcda598ad9fdabc42be5"/>
+    <w:bookmarkStart w:id="22" w:name="slayt-12-şifre-kırma-animasyonu"/>
     <w:p>
       <w:pPr>
         <w:pStyle w:val="Heading3"/>
       </w:pPr>
       <w:r>
-        <w:t xml:space="preserve">Slayt 12 ·</w:t>
-      </w:r>
-      <w:r>
-        <w:t xml:space="preserve"> </w:t>
-      </w:r>
-      <w:r>
-        <w:t xml:space="preserve">“Şifrenizi tanımadığınız bir sayfaya verdiniz.”</w:t>
+        <w:t xml:space="preserve">Slayt 12 · Şifre Kırma Animasyonu</w:t>
       </w:r>
     </w:p>
     <w:p>
@@ -1300,23 +1290,117 @@
         <w:pStyle w:val="BlockText"/>
       </w:pPr>
       <w:r>
-        <w:t xml:space="preserve">“Az önceki sayfaya güvendiniz. Ben sadece parmak izini aldım. Yarın sahte bir bankamatik sayfası, sahte bir Garanti girişi olsa — şifrenin</w:t>
-      </w:r>
-      <w:r>
-        <w:t xml:space="preserve"> </w:t>
-      </w:r>
-      <w:r>
-        <w:rPr>
-          <w:b/>
-          <w:bCs/>
-        </w:rPr>
-        <w:t xml:space="preserve">tam halini</w:t>
-      </w:r>
-      <w:r>
-        <w:t xml:space="preserve"> </w:t>
-      </w:r>
-      <w:r>
-        <w:t xml:space="preserve">alırdı. Bu ders bedavaya geldi.”</w:t>
+        <w:t xml:space="preserve">“Beş örnek şifreyi sırayla saldırgana veriyoruz.</w:t>
+      </w:r>
+      <w:r>
+        <w:t xml:space="preserve"> </w:t>
+      </w:r>
+      <w:r>
+        <w:rPr>
+          <w:b/>
+          <w:bCs/>
+        </w:rPr>
+        <w:t xml:space="preserve">‘123456’</w:t>
+      </w:r>
+      <w:r>
+        <w:t xml:space="preserve"> </w:t>
+      </w:r>
+      <w:r>
+        <w:t xml:space="preserve">— anında.</w:t>
+      </w:r>
+      <w:r>
+        <w:t xml:space="preserve"> </w:t>
+      </w:r>
+      <w:r>
+        <w:rPr>
+          <w:b/>
+          <w:bCs/>
+        </w:rPr>
+        <w:t xml:space="preserve">‘ankara06’</w:t>
+      </w:r>
+      <w:r>
+        <w:t xml:space="preserve"> </w:t>
+      </w:r>
+      <w:r>
+        <w:t xml:space="preserve">— 0,3 saniye.</w:t>
+      </w:r>
+      <w:r>
+        <w:t xml:space="preserve"> </w:t>
+      </w:r>
+      <w:r>
+        <w:rPr>
+          <w:b/>
+          <w:bCs/>
+        </w:rPr>
+        <w:t xml:space="preserve">‘Kalem42!’</w:t>
+      </w:r>
+      <w:r>
+        <w:t xml:space="preserve"> </w:t>
+      </w:r>
+      <w:r>
+        <w:t xml:space="preserve">— yedi dakika.</w:t>
+      </w:r>
+      <w:r>
+        <w:t xml:space="preserve"> </w:t>
+      </w:r>
+      <w:r>
+        <w:rPr>
+          <w:b/>
+          <w:bCs/>
+        </w:rPr>
+        <w:t xml:space="preserve">12 karışık karakter</w:t>
+      </w:r>
+      <w:r>
+        <w:t xml:space="preserve"> </w:t>
+      </w:r>
+      <w:r>
+        <w:t xml:space="preserve">— 3.000 yıl, saldırgan vazgeçer.</w:t>
+      </w:r>
+      <w:r>
+        <w:t xml:space="preserve"> </w:t>
+      </w:r>
+      <w:r>
+        <w:rPr>
+          <w:b/>
+          <w:bCs/>
+        </w:rPr>
+        <w:t xml:space="preserve">Cümle şifre</w:t>
+      </w:r>
+      <w:r>
+        <w:t xml:space="preserve"> </w:t>
+      </w:r>
+      <w:r>
+        <w:t xml:space="preserve">—</w:t>
+      </w:r>
+      <w:r>
+        <w:t xml:space="preserve"> </w:t>
+      </w:r>
+      <w:r>
+        <w:t xml:space="preserve">‘Manisa-uzumleri-2026!’</w:t>
+      </w:r>
+      <w:r>
+        <w:t xml:space="preserve"> </w:t>
+      </w:r>
+      <w:r>
+        <w:t xml:space="preserve">— sonsuz. Fark ettiniz mi? Uzunluk + farklı karakter = bambaşka bir oyun.”</w:t>
+      </w:r>
+    </w:p>
+    <w:p>
+      <w:pPr>
+        <w:pStyle w:val="FirstParagraph"/>
+      </w:pPr>
+      <w:r>
+        <w:rPr>
+          <w:b/>
+          <w:bCs/>
+        </w:rPr>
+        <w:t xml:space="preserve">Yapılacak:</w:t>
+      </w:r>
+      <w:r>
+        <w:t xml:space="preserve"> </w:t>
+      </w:r>
+      <w:r>
+        <w:t xml:space="preserve">Animasyon ~30 saniye, kendi başına oynar.</w:t>
       </w:r>
     </w:p>
     <w:p>
@@ -1327,13 +1411,13 @@
       </w:r>
     </w:p>
     <w:bookmarkEnd w:id="22"/>
-    <w:bookmarkStart w:id="23" w:name="slayt-13-cümle-şifre-2fa"/>
+    <w:bookmarkStart w:id="23" w:name="Xc67de5be0e2a05c0a934749c5624a2e42377cd2"/>
     <w:p>
       <w:pPr>
         <w:pStyle w:val="Heading3"/>
       </w:pPr>
       <w:r>
-        <w:t xml:space="preserve">Slayt 13 · Cümle-Şifre + 2FA</w:t>
+        <w:t xml:space="preserve">Slayt 13 · CANLI DENEY · Telefonunla Şifre Test Et</w:t>
       </w:r>
     </w:p>
     <w:p>
@@ -1341,35 +1425,91 @@
         <w:pStyle w:val="BlockText"/>
       </w:pPr>
       <w:r>
-        <w:t xml:space="preserve">“Sol taraf yapmayın listesi: aynı parola her sitede, doğum tarihi, takım adı, sticky note. SMS 2FA tek başına güvenli değil — SIM swap saldırısı 5 dakikada hesabına girer. Sağ taraf yapılması gerekenler:</w:t>
-      </w:r>
-      <w:r>
-        <w:t xml:space="preserve"> </w:t>
-      </w:r>
-      <w:r>
-        <w:t xml:space="preserve">‘Manisa-uzumleri-2026!’</w:t>
-      </w:r>
-      <w:r>
-        <w:t xml:space="preserve"> </w:t>
-      </w:r>
-      <w:r>
-        <w:t xml:space="preserve">gibi cümle-şifre. Her hesaba farklı parola → bunu hatırlamak imkânsız,</w:t>
-      </w:r>
-      <w:r>
-        <w:t xml:space="preserve"> </w:t>
-      </w:r>
-      <w:r>
-        <w:rPr>
-          <w:b/>
-          <w:bCs/>
-        </w:rPr>
-        <w:t xml:space="preserve">şifre yöneticisi</w:t>
-      </w:r>
-      <w:r>
-        <w:t xml:space="preserve"> </w:t>
-      </w:r>
-      <w:r>
-        <w:t xml:space="preserve">kullan: 1Password, Bitwarden veya Apple/Google parolaları. Authenticator uygulaması. Kritik hesaplarda passkey veya donanım anahtarı.”</w:t>
+        <w:t xml:space="preserve">“Şimdi sıra sende. QR’ı tarat, kendi kullandığın bir şifreyi yaz —</w:t>
+      </w:r>
+      <w:r>
+        <w:t xml:space="preserve"> </w:t>
+      </w:r>
+      <w:r>
+        <w:rPr>
+          <w:b/>
+          <w:bCs/>
+        </w:rPr>
+        <w:t xml:space="preserve">gerçek şifre ekrana yansımıyor</w:t>
+      </w:r>
+      <w:r>
+        <w:t xml:space="preserve"> </w:t>
+      </w:r>
+      <w:r>
+        <w:t xml:space="preserve">— sadece uzunluğu, gücü ve sızıntıda olup olmadığı yansıyor.</w:t>
+      </w:r>
+      <w:r>
+        <w:t xml:space="preserve"> </w:t>
+      </w:r>
+      <w:r>
+        <w:t xml:space="preserve">‘Sonucu ekrana yansıt’</w:t>
+      </w:r>
+      <w:r>
+        <w:t xml:space="preserve"> </w:t>
+      </w:r>
+      <w:r>
+        <w:t xml:space="preserve">butonuna bas. Bekleyelim.”</w:t>
+      </w:r>
+    </w:p>
+    <w:p>
+      <w:pPr>
+        <w:pStyle w:val="FirstParagraph"/>
+      </w:pPr>
+      <w:r>
+        <w:rPr>
+          <w:b/>
+          <w:bCs/>
+        </w:rPr>
+        <w:t xml:space="preserve">Yapılacak:</w:t>
+      </w:r>
+      <w:r>
+        <w:t xml:space="preserve"> </w:t>
+      </w:r>
+      <w:r>
+        <w:t xml:space="preserve">İlk testin gelmesini bekle (10–20 sn). Boşluğa basınca</w:t>
+      </w:r>
+      <w:r>
+        <w:t xml:space="preserve"> </w:t>
+      </w:r>
+      <w:r>
+        <w:rPr>
+          <w:b/>
+          <w:bCs/>
+        </w:rPr>
+        <w:t xml:space="preserve">reveal fazı</w:t>
+      </w:r>
+      <w:r>
+        <w:t xml:space="preserve"> </w:t>
+      </w:r>
+      <w:r>
+        <w:t xml:space="preserve">açılır.</w:t>
+      </w:r>
+      <w:r>
+        <w:t xml:space="preserve"> </w:t>
+      </w:r>
+      <w:r>
+        <w:t xml:space="preserve">“İşte bunlar sizin şifreleriniz — gerçek phishing sayfası şifrenin</w:t>
+      </w:r>
+      <w:r>
+        <w:t xml:space="preserve"> </w:t>
+      </w:r>
+      <w:r>
+        <w:rPr>
+          <w:b/>
+          <w:bCs/>
+        </w:rPr>
+        <w:t xml:space="preserve">kendisini</w:t>
+      </w:r>
+      <w:r>
+        <w:t xml:space="preserve"> </w:t>
+      </w:r>
+      <w:r>
+        <w:t xml:space="preserve">de alır.”</w:t>
       </w:r>
     </w:p>
     <w:p>
@@ -1380,23 +1520,19 @@
       </w:r>
     </w:p>
     <w:bookmarkEnd w:id="23"/>
-    <w:bookmarkEnd w:id="24"/>
-    <w:bookmarkStart w:id="35" w:name="bölüm-4-sosyal-mühendislik"/>
-    <w:p>
-      <w:pPr>
-        <w:pStyle w:val="Heading2"/>
-      </w:pPr>
-      <w:r>
-        <w:t xml:space="preserve">BÖLÜM 4 · SOSYAL MÜHENDİSLİK</w:t>
-      </w:r>
-    </w:p>
-    <w:bookmarkStart w:id="25" w:name="slayt-14-bölüm-02-başlık"/>
+    <w:bookmarkStart w:id="24" w:name="Xe4e57fb20323e57690ea06b9109f5b11f79c7a8"/>
     <w:p>
       <w:pPr>
         <w:pStyle w:val="Heading3"/>
       </w:pPr>
       <w:r>
-        <w:t xml:space="preserve">Slayt 14 · Bölüm 02 başlık</w:t>
+        <w:t xml:space="preserve">Slayt 14 ·</w:t>
+      </w:r>
+      <w:r>
+        <w:t xml:space="preserve"> </w:t>
+      </w:r>
+      <w:r>
+        <w:t xml:space="preserve">“Şifrenizi tanımadığınız bir sayfaya verdiniz.”</w:t>
       </w:r>
     </w:p>
     <w:p>
@@ -1404,7 +1540,23 @@
         <w:pStyle w:val="BlockText"/>
       </w:pPr>
       <w:r>
-        <w:t xml:space="preserve">“Güvenlik duvarı geçilemiyorsa, kullanıcı ikna edilir. İnsanlar hacklenmez — ikna edilir.”</w:t>
+        <w:t xml:space="preserve">“Az önceki sayfaya güvendiniz. Ben sadece parmak izini aldım. Yarın sahte bir Garanti girişi olsa — şifrenin</w:t>
+      </w:r>
+      <w:r>
+        <w:t xml:space="preserve"> </w:t>
+      </w:r>
+      <w:r>
+        <w:rPr>
+          <w:b/>
+          <w:bCs/>
+        </w:rPr>
+        <w:t xml:space="preserve">tam halini</w:t>
+      </w:r>
+      <w:r>
+        <w:t xml:space="preserve"> </w:t>
+      </w:r>
+      <w:r>
+        <w:t xml:space="preserve">alırdı. Bu ders bedavaya geldi.”</w:t>
       </w:r>
     </w:p>
     <w:p>
@@ -1414,14 +1566,14 @@
         </w:pict>
       </w:r>
     </w:p>
-    <w:bookmarkEnd w:id="25"/>
-    <w:bookmarkStart w:id="26" w:name="slayt-15-saldırganın-5-silahı"/>
+    <w:bookmarkEnd w:id="24"/>
+    <w:bookmarkStart w:id="25" w:name="slayt-15-cümle-şifre-2fa"/>
     <w:p>
       <w:pPr>
         <w:pStyle w:val="Heading3"/>
       </w:pPr>
       <w:r>
-        <w:t xml:space="preserve">Slayt 15 · Saldırganın 5 Silahı</w:t>
+        <w:t xml:space="preserve">Slayt 15 · Cümle-Şifre + 2FA</w:t>
       </w:r>
     </w:p>
     <w:p>
@@ -1429,96 +1581,23 @@
         <w:pStyle w:val="BlockText"/>
       </w:pPr>
       <w:r>
-        <w:t xml:space="preserve">“Beş silah var, hepsi her dolandırıcılıkta vardır.</w:t>
-      </w:r>
-      <w:r>
-        <w:t xml:space="preserve"> </w:t>
-      </w:r>
-      <w:r>
-        <w:rPr>
-          <w:b/>
-          <w:bCs/>
-        </w:rPr>
-        <w:t xml:space="preserve">Aciliyet:</w:t>
-      </w:r>
-      <w:r>
-        <w:t xml:space="preserve"> </w:t>
-      </w:r>
-      <w:r>
-        <w:t xml:space="preserve">‘şimdi yapmazsan kaybedeceksin’</w:t>
-      </w:r>
-      <w:r>
-        <w:t xml:space="preserve">.</w:t>
-      </w:r>
-      <w:r>
-        <w:t xml:space="preserve"> </w:t>
-      </w:r>
-      <w:r>
-        <w:rPr>
-          <w:b/>
-          <w:bCs/>
-        </w:rPr>
-        <w:t xml:space="preserve">Otorite:</w:t>
-      </w:r>
-      <w:r>
-        <w:t xml:space="preserve"> </w:t>
-      </w:r>
-      <w:r>
-        <w:t xml:space="preserve">savcı, polis, banka müdürü, BTK.</w:t>
-      </w:r>
-      <w:r>
-        <w:t xml:space="preserve"> </w:t>
-      </w:r>
-      <w:r>
-        <w:rPr>
-          <w:b/>
-          <w:bCs/>
-        </w:rPr>
-        <w:t xml:space="preserve">Korku:</w:t>
-      </w:r>
-      <w:r>
-        <w:t xml:space="preserve"> </w:t>
-      </w:r>
-      <w:r>
-        <w:t xml:space="preserve">hesabın kapanacak, suç işledin.</w:t>
-      </w:r>
-      <w:r>
-        <w:t xml:space="preserve"> </w:t>
-      </w:r>
-      <w:r>
-        <w:rPr>
-          <w:b/>
-          <w:bCs/>
-        </w:rPr>
-        <w:t xml:space="preserve">Ödül:</w:t>
-      </w:r>
-      <w:r>
-        <w:t xml:space="preserve"> </w:t>
-      </w:r>
-      <w:r>
-        <w:t xml:space="preserve">‘iPhone kazandın’</w:t>
-      </w:r>
-      <w:r>
-        <w:t xml:space="preserve">.</w:t>
-      </w:r>
-      <w:r>
-        <w:t xml:space="preserve"> </w:t>
-      </w:r>
-      <w:r>
-        <w:rPr>
-          <w:b/>
-          <w:bCs/>
-        </w:rPr>
-        <w:t xml:space="preserve">Güven:</w:t>
-      </w:r>
-      <w:r>
-        <w:t xml:space="preserve"> </w:t>
-      </w:r>
-      <w:r>
-        <w:t xml:space="preserve">‘tanıdığım, akraban’</w:t>
-      </w:r>
-      <w:r>
-        <w:t xml:space="preserve">. Bir mesajda iki silah varsa: durun. Üç silah varsa: ihbar.”</w:t>
+        <w:t xml:space="preserve">“Sol taraf yapmayın: aynı parola, doğum tarihi, takım adı, monitör kenarında sticky note. SMS 2FA tek başına güvenli değil — SIM swap saldırısı 5 dakikada hesabına girer. Sağ taraf yapın: cümle-şifre. Her hesaba farklı parola →</w:t>
+      </w:r>
+      <w:r>
+        <w:t xml:space="preserve"> </w:t>
+      </w:r>
+      <w:r>
+        <w:rPr>
+          <w:b/>
+          <w:bCs/>
+        </w:rPr>
+        <w:t xml:space="preserve">şifre yöneticisi</w:t>
+      </w:r>
+      <w:r>
+        <w:t xml:space="preserve"> </w:t>
+      </w:r>
+      <w:r>
+        <w:t xml:space="preserve">kullan: 1Password, Bitwarden veya Apple/Google parolaları. Authenticator uygulaması. Kritik hesaplarda passkey.”</w:t>
       </w:r>
     </w:p>
     <w:p>
@@ -1528,14 +1607,24 @@
         </w:pict>
       </w:r>
     </w:p>
+    <w:bookmarkEnd w:id="25"/>
     <w:bookmarkEnd w:id="26"/>
-    <w:bookmarkStart w:id="27" w:name="slayt-16-whatsapp-iş-teklifi-tuzağı"/>
+    <w:bookmarkStart w:id="38" w:name="bölüm-4-sosyal-mühendislik"/>
+    <w:p>
+      <w:pPr>
+        <w:pStyle w:val="Heading2"/>
+      </w:pPr>
+      <w:r>
+        <w:t xml:space="preserve">BÖLÜM 4 · SOSYAL MÜHENDİSLİK</w:t>
+      </w:r>
+    </w:p>
+    <w:bookmarkStart w:id="27" w:name="slayt-16-bölüm-02-başlık"/>
     <w:p>
       <w:pPr>
         <w:pStyle w:val="Heading3"/>
       </w:pPr>
       <w:r>
-        <w:t xml:space="preserve">Slayt 16 · WhatsApp · İş Teklifi Tuzağı</w:t>
+        <w:t xml:space="preserve">Slayt 16 · Bölüm 02 başlık</w:t>
       </w:r>
     </w:p>
     <w:p>
@@ -1543,105 +1632,7 @@
         <w:pStyle w:val="BlockText"/>
       </w:pPr>
       <w:r>
-        <w:t xml:space="preserve">“WhatsApp’ta gelen bir mesaj canlandı.</w:t>
-      </w:r>
-      <w:r>
-        <w:t xml:space="preserve"> </w:t>
-      </w:r>
-      <w:r>
-        <w:t xml:space="preserve">‘TikTok ajansından arıyoruz, kampanyamızda yer almak ister misin?’</w:t>
-      </w:r>
-      <w:r>
-        <w:t xml:space="preserve">,</w:t>
-      </w:r>
-      <w:r>
-        <w:t xml:space="preserve"> </w:t>
-      </w:r>
-      <w:r>
-        <w:t xml:space="preserve">‘günlük 800–2500 TL kazanırsın, sadece beğeni atacaksın’</w:t>
-      </w:r>
-      <w:r>
-        <w:t xml:space="preserve">,</w:t>
-      </w:r>
-      <w:r>
-        <w:t xml:space="preserve"> </w:t>
-      </w:r>
-      <w:r>
-        <w:t xml:space="preserve">‘ilk göreve başlamak için: bit.ly/…’</w:t>
-      </w:r>
-      <w:r>
-        <w:t xml:space="preserve">. Sen</w:t>
-      </w:r>
-      <w:r>
-        <w:t xml:space="preserve"> </w:t>
-      </w:r>
-      <w:r>
-        <w:t xml:space="preserve">‘tmm bakayım’</w:t>
-      </w:r>
-      <w:r>
-        <w:t xml:space="preserve"> </w:t>
-      </w:r>
-      <w:r>
-        <w:t xml:space="preserve">diyorsun — beş saniye sonra</w:t>
-      </w:r>
-      <w:r>
-        <w:t xml:space="preserve"> </w:t>
-      </w:r>
-      <w:r>
-        <w:t xml:space="preserve">‘tebrikler 250 TL kazandın! çekmek için 5.000 TL teminat’</w:t>
-      </w:r>
-      <w:r>
-        <w:t xml:space="preserve">.</w:t>
-      </w:r>
-      <w:r>
-        <w:t xml:space="preserve"> </w:t>
-      </w:r>
-      <w:r>
-        <w:rPr>
-          <w:b/>
-          <w:bCs/>
-        </w:rPr>
-        <w:t xml:space="preserve">İşte tam burada hesabın çalınıyor.</w:t>
-      </w:r>
-      <w:r>
-        <w:t xml:space="preserve"> </w:t>
-      </w:r>
-      <w:r>
-        <w:t xml:space="preserve">Linke tıkladığın an WhatsApp QR girişin saldırgana geçti,</w:t>
-      </w:r>
-      <w:r>
-        <w:t xml:space="preserve"> </w:t>
-      </w:r>
-      <w:r>
-        <w:rPr>
-          <w:b/>
-          <w:bCs/>
-        </w:rPr>
-        <w:t xml:space="preserve">347 arkadaşın şu anda aynı mesajı senden alıyor.</w:t>
-      </w:r>
-      <w:r>
-        <w:t xml:space="preserve"> </w:t>
-      </w:r>
-      <w:r>
-        <w:t xml:space="preserve">Tek tıklama, bütün ağ.”</w:t>
-      </w:r>
-    </w:p>
-    <w:p>
-      <w:pPr>
-        <w:pStyle w:val="FirstParagraph"/>
-      </w:pPr>
-      <w:r>
-        <w:rPr>
-          <w:b/>
-          <w:bCs/>
-        </w:rPr>
-        <w:t xml:space="preserve">Yapılacak:</w:t>
-      </w:r>
-      <w:r>
-        <w:t xml:space="preserve"> </w:t>
-      </w:r>
-      <w:r>
-        <w:t xml:space="preserve">Mesajlar sırayla yazılır (~10 saniye), sonra otomatik kırmızı reveal. Sen reveal’a kadar sus.</w:t>
+        <w:t xml:space="preserve">“Güvenlik duvarı geçilemiyorsa, kullanıcı ikna edilir. İnsanlar hacklenmez — ikna edilir.”</w:t>
       </w:r>
     </w:p>
     <w:p>
@@ -1652,13 +1643,13 @@
       </w:r>
     </w:p>
     <w:bookmarkEnd w:id="27"/>
-    <w:bookmarkStart w:id="28" w:name="slayt-17-vishing-sahte-savcılık-araması"/>
+    <w:bookmarkStart w:id="28" w:name="slayt-17-saldırganın-5-silahı"/>
     <w:p>
       <w:pPr>
         <w:pStyle w:val="Heading3"/>
       </w:pPr>
       <w:r>
-        <w:t xml:space="preserve">Slayt 17 · Vishing · Sahte Savcılık Araması</w:t>
+        <w:t xml:space="preserve">Slayt 17 · Saldırganın 5 Silahı</w:t>
       </w:r>
     </w:p>
     <w:p>
@@ -1666,57 +1657,23 @@
         <w:pStyle w:val="BlockText"/>
       </w:pPr>
       <w:r>
-        <w:t xml:space="preserve">“Telefon çalıyor: Ankara Cumhuriyet Başsavcılığı. Açıyoruz.</w:t>
-      </w:r>
-      <w:r>
-        <w:t xml:space="preserve"> </w:t>
-      </w:r>
-      <w:r>
-        <w:t xml:space="preserve">‘İyi günler, ben Komiser Yılmaz’</w:t>
-      </w:r>
-      <w:r>
-        <w:t xml:space="preserve"> </w:t>
-      </w:r>
-      <w:r>
-        <w:t xml:space="preserve">—</w:t>
-      </w:r>
-      <w:r>
-        <w:t xml:space="preserve"> </w:t>
-      </w:r>
-      <w:r>
-        <w:rPr>
-          <w:b/>
-          <w:bCs/>
-        </w:rPr>
-        <w:t xml:space="preserve">OTORİTE</w:t>
-      </w:r>
-      <w:r>
-        <w:t xml:space="preserve"> </w:t>
-      </w:r>
-      <w:r>
-        <w:t xml:space="preserve">silahı.</w:t>
-      </w:r>
-      <w:r>
-        <w:t xml:space="preserve"> </w:t>
-      </w:r>
-      <w:r>
-        <w:t xml:space="preserve">‘Adınıza açılmış bir soruşturma var, hesabınızdan terör örgütüne para transferi yapılmış’</w:t>
-      </w:r>
-      <w:r>
-        <w:t xml:space="preserve"> </w:t>
-      </w:r>
-      <w:r>
-        <w:t xml:space="preserve">—</w:t>
-      </w:r>
-      <w:r>
-        <w:t xml:space="preserve"> </w:t>
-      </w:r>
-      <w:r>
-        <w:rPr>
-          <w:b/>
-          <w:bCs/>
-        </w:rPr>
-        <w:t xml:space="preserve">KORKU</w:t>
+        <w:t xml:space="preserve">“Beş silah var, hepsi her dolandırıcılıkta vardır.</w:t>
+      </w:r>
+      <w:r>
+        <w:t xml:space="preserve"> </w:t>
+      </w:r>
+      <w:r>
+        <w:rPr>
+          <w:b/>
+          <w:bCs/>
+        </w:rPr>
+        <w:t xml:space="preserve">Aciliyet:</w:t>
+      </w:r>
+      <w:r>
+        <w:t xml:space="preserve"> </w:t>
+      </w:r>
+      <w:r>
+        <w:t xml:space="preserve">‘şimdi yapmazsan kaybedeceksin’</w:t>
       </w:r>
       <w:r>
         <w:t xml:space="preserve">.</w:t>
@@ -1725,23 +1682,49 @@
         <w:t xml:space="preserve"> </w:t>
       </w:r>
       <w:r>
-        <w:t xml:space="preserve">‘15 dakika içinde ifade alamazsak gözaltı kararı’</w:t>
-      </w:r>
-      <w:r>
-        <w:t xml:space="preserve"> </w:t>
-      </w:r>
-      <w:r>
-        <w:t xml:space="preserve">—</w:t>
-      </w:r>
-      <w:r>
-        <w:t xml:space="preserve"> </w:t>
-      </w:r>
-      <w:r>
-        <w:rPr>
-          <w:b/>
-          <w:bCs/>
-        </w:rPr>
-        <w:t xml:space="preserve">ACİLİYET</w:t>
+        <w:rPr>
+          <w:b/>
+          <w:bCs/>
+        </w:rPr>
+        <w:t xml:space="preserve">Otorite:</w:t>
+      </w:r>
+      <w:r>
+        <w:t xml:space="preserve"> </w:t>
+      </w:r>
+      <w:r>
+        <w:t xml:space="preserve">savcı, polis, banka müdürü.</w:t>
+      </w:r>
+      <w:r>
+        <w:t xml:space="preserve"> </w:t>
+      </w:r>
+      <w:r>
+        <w:rPr>
+          <w:b/>
+          <w:bCs/>
+        </w:rPr>
+        <w:t xml:space="preserve">Korku:</w:t>
+      </w:r>
+      <w:r>
+        <w:t xml:space="preserve"> </w:t>
+      </w:r>
+      <w:r>
+        <w:t xml:space="preserve">hesabın kapanacak.</w:t>
+      </w:r>
+      <w:r>
+        <w:t xml:space="preserve"> </w:t>
+      </w:r>
+      <w:r>
+        <w:rPr>
+          <w:b/>
+          <w:bCs/>
+        </w:rPr>
+        <w:t xml:space="preserve">Ödül:</w:t>
+      </w:r>
+      <w:r>
+        <w:t xml:space="preserve"> </w:t>
+      </w:r>
+      <w:r>
+        <w:t xml:space="preserve">‘iPhone kazandın’</w:t>
       </w:r>
       <w:r>
         <w:t xml:space="preserve">.</w:t>
@@ -1750,67 +1733,20 @@
         <w:t xml:space="preserve"> </w:t>
       </w:r>
       <w:r>
-        <w:t xml:space="preserve">‘Bu görüşme gizli, kimseyle paylaşamazsınız’</w:t>
-      </w:r>
-      <w:r>
-        <w:t xml:space="preserve"> </w:t>
-      </w:r>
-      <w:r>
-        <w:t xml:space="preserve">—</w:t>
-      </w:r>
-      <w:r>
-        <w:t xml:space="preserve"> </w:t>
-      </w:r>
-      <w:r>
-        <w:rPr>
-          <w:b/>
-          <w:bCs/>
-        </w:rPr>
-        <w:t xml:space="preserve">İZOLASYON</w:t>
-      </w:r>
-      <w:r>
-        <w:t xml:space="preserve">.</w:t>
-      </w:r>
-      <w:r>
-        <w:t xml:space="preserve"> </w:t>
-      </w:r>
-      <w:r>
-        <w:t xml:space="preserve">‘Tüm paranızı emanet hesabına aktarın, ATM’ye gidin, ben telefonda kalıyorum’</w:t>
-      </w:r>
-      <w:r>
-        <w:t xml:space="preserve"> </w:t>
-      </w:r>
-      <w:r>
-        <w:t xml:space="preserve">—</w:t>
-      </w:r>
-      <w:r>
-        <w:t xml:space="preserve"> </w:t>
-      </w:r>
-      <w:r>
-        <w:rPr>
-          <w:b/>
-          <w:bCs/>
-        </w:rPr>
-        <w:t xml:space="preserve">VURGUN</w:t>
-      </w:r>
-      <w:r>
-        <w:t xml:space="preserve">. Beş silah, beş cümle. Devlet asla telefonda para istemez. Kapat — banka ve aile numaralarını</w:t>
-      </w:r>
-      <w:r>
-        <w:t xml:space="preserve"> </w:t>
-      </w:r>
-      <w:r>
-        <w:rPr>
-          <w:b/>
-          <w:bCs/>
-        </w:rPr>
-        <w:t xml:space="preserve">kendin</w:t>
-      </w:r>
-      <w:r>
-        <w:t xml:space="preserve"> </w:t>
-      </w:r>
-      <w:r>
-        <w:t xml:space="preserve">ara.”</w:t>
+        <w:rPr>
+          <w:b/>
+          <w:bCs/>
+        </w:rPr>
+        <w:t xml:space="preserve">Güven:</w:t>
+      </w:r>
+      <w:r>
+        <w:t xml:space="preserve"> </w:t>
+      </w:r>
+      <w:r>
+        <w:t xml:space="preserve">‘tanıdığım, akraban’</w:t>
+      </w:r>
+      <w:r>
+        <w:t xml:space="preserve">. Bir mesajda iki silah varsa: dur. Üç silah varsa: ihbar.”</w:t>
       </w:r>
     </w:p>
     <w:p>
@@ -1821,13 +1757,13 @@
       </w:r>
     </w:p>
     <w:bookmarkEnd w:id="28"/>
-    <w:bookmarkStart w:id="29" w:name="slayt-18-predatory-dergi"/>
+    <w:bookmarkStart w:id="29" w:name="Xefc1eab3ba364dca4b08c1f78922a06c7f7154d"/>
     <w:p>
       <w:pPr>
         <w:pStyle w:val="Heading3"/>
       </w:pPr>
       <w:r>
-        <w:t xml:space="preserve">Slayt 18 · Predatory Dergi</w:t>
+        <w:t xml:space="preserve">Slayt 18 · Crypto / Yatırım Dolandırıcılığı (YENİ)</w:t>
       </w:r>
     </w:p>
     <w:p>
@@ -1835,62 +1771,101 @@
         <w:pStyle w:val="BlockText"/>
       </w:pPr>
       <w:r>
-        <w:t xml:space="preserve">“Akademisyenler dinliyor — sıra sizde. Mail kutusu:</w:t>
-      </w:r>
-      <w:r>
-        <w:t xml:space="preserve"> </w:t>
-      </w:r>
-      <w:r>
-        <w:t xml:space="preserve">‘editor@ijar-publishing.net’</w:t>
-      </w:r>
-      <w:r>
-        <w:t xml:space="preserve"> </w:t>
-      </w:r>
-      <w:r>
-        <w:t xml:space="preserve">—</w:t>
-      </w:r>
-      <w:r>
-        <w:t xml:space="preserve"> </w:t>
-      </w:r>
-      <w:r>
-        <w:t xml:space="preserve">‘manuscript ACCEPTED’</w:t>
-      </w:r>
-      <w:r>
-        <w:t xml:space="preserve">. 18 saatte hakem onayı — bu süre hakem değil, kredi kartı bekleme süresi. RIIF 8,4</w:t>
-      </w:r>
-      <w:r>
-        <w:t xml:space="preserve"> </w:t>
-      </w:r>
-      <w:r>
-        <w:t xml:space="preserve">‘impact factor’</w:t>
-      </w:r>
-      <w:r>
-        <w:t xml:space="preserve"> </w:t>
-      </w:r>
-      <w:r>
-        <w:t xml:space="preserve">— Web of Science’da böyle bir şey yok, uydurma.</w:t>
-      </w:r>
-      <w:r>
-        <w:t xml:space="preserve"> </w:t>
-      </w:r>
-      <w:r>
-        <w:t xml:space="preserve">‘349 dolar yayın ücreti’</w:t>
-      </w:r>
-      <w:r>
-        <w:t xml:space="preserve">. Ödeyenin makalesi</w:t>
-      </w:r>
-      <w:r>
-        <w:t xml:space="preserve"> </w:t>
-      </w:r>
-      <w:r>
-        <w:rPr>
-          <w:b/>
-          <w:bCs/>
-        </w:rPr>
-        <w:t xml:space="preserve">akademik özgeçmişe sayılmaz</w:t>
-      </w:r>
-      <w:r>
-        <w:t xml:space="preserve">, ÜAK reddeder. Kontrol kanalı: DOAJ, Beall’s List, ULAKBİM TR-Dizin.”</w:t>
+        <w:t xml:space="preserve">“Türkiye’nin en pahalı dersi: hızlı para vaadi.</w:t>
+      </w:r>
+      <w:r>
+        <w:t xml:space="preserve"> </w:t>
+      </w:r>
+      <w:r>
+        <w:rPr>
+          <w:b/>
+          <w:bCs/>
+        </w:rPr>
+        <w:t xml:space="preserve">Thodex:</w:t>
+      </w:r>
+      <w:r>
+        <w:t xml:space="preserve"> </w:t>
+      </w:r>
+      <w:r>
+        <w:t xml:space="preserve">24 milyar TL, 400.000 mağdur — kurucu kaçtı, hâlâ yakalanmadı.</w:t>
+      </w:r>
+      <w:r>
+        <w:t xml:space="preserve"> </w:t>
+      </w:r>
+      <w:r>
+        <w:rPr>
+          <w:b/>
+          <w:bCs/>
+        </w:rPr>
+        <w:t xml:space="preserve">Çiftlik Bank:</w:t>
+      </w:r>
+      <w:r>
+        <w:t xml:space="preserve"> </w:t>
+      </w:r>
+      <w:r>
+        <w:t xml:space="preserve">5 milyar TL, 132.000 mağdur — klasik Ponzi şeması.</w:t>
+      </w:r>
+      <w:r>
+        <w:t xml:space="preserve"> </w:t>
+      </w:r>
+      <w:r>
+        <w:rPr>
+          <w:b/>
+          <w:bCs/>
+        </w:rPr>
+        <w:t xml:space="preserve">2025’te deepfake yatırım reklamı artışı: %430</w:t>
+      </w:r>
+      <w:r>
+        <w:t xml:space="preserve"> </w:t>
+      </w:r>
+      <w:r>
+        <w:t xml:space="preserve">— Acun Ilıcalı, ünlü oyuncular, profesörler taklit edilip</w:t>
+      </w:r>
+      <w:r>
+        <w:t xml:space="preserve"> </w:t>
+      </w:r>
+      <w:r>
+        <w:t xml:space="preserve">‘günde 5000 TL kazan’</w:t>
+      </w:r>
+      <w:r>
+        <w:t xml:space="preserve"> </w:t>
+      </w:r>
+      <w:r>
+        <w:t xml:space="preserve">diye reklam çıkıyor.</w:t>
+      </w:r>
+      <w:r>
+        <w:t xml:space="preserve"> </w:t>
+      </w:r>
+      <w:r>
+        <w:rPr>
+          <w:b/>
+          <w:bCs/>
+        </w:rPr>
+        <w:t xml:space="preserve">Tahminen 20 milyon Türk</w:t>
+      </w:r>
+      <w:r>
+        <w:t xml:space="preserve"> </w:t>
+      </w:r>
+      <w:r>
+        <w:t xml:space="preserve">yatırım dolandırıcılığına maruz kaldı. Kural: hızlı kazan vaadi = kayıp.”</w:t>
+      </w:r>
+    </w:p>
+    <w:p>
+      <w:pPr>
+        <w:pStyle w:val="FirstParagraph"/>
+      </w:pPr>
+      <w:r>
+        <w:rPr>
+          <w:b/>
+          <w:bCs/>
+        </w:rPr>
+        <w:t xml:space="preserve">Yapılacak:</w:t>
+      </w:r>
+      <w:r>
+        <w:t xml:space="preserve"> </w:t>
+      </w:r>
+      <w:r>
+        <w:t xml:space="preserve">Her sayıyı vurgula. Audience çoğu Thodex ismini tanır.</w:t>
       </w:r>
     </w:p>
     <w:p>
@@ -1901,13 +1876,13 @@
       </w:r>
     </w:p>
     <w:bookmarkEnd w:id="29"/>
-    <w:bookmarkStart w:id="30" w:name="slayt-19-sahte-konferans-davetiyesi"/>
+    <w:bookmarkStart w:id="30" w:name="slayt-19-whatsapp-iş-teklifi-tuzağı"/>
     <w:p>
       <w:pPr>
         <w:pStyle w:val="Heading3"/>
       </w:pPr>
       <w:r>
-        <w:t xml:space="preserve">Slayt 19 · Sahte Konferans Davetiyesi</w:t>
+        <w:t xml:space="preserve">Slayt 19 · WhatsApp · İş Teklifi Tuzağı</w:t>
       </w:r>
     </w:p>
     <w:p>
@@ -1915,31 +1890,105 @@
         <w:pStyle w:val="BlockText"/>
       </w:pPr>
       <w:r>
-        <w:t xml:space="preserve">“Aynı kalıp konferans için.</w:t>
-      </w:r>
-      <w:r>
-        <w:t xml:space="preserve"> </w:t>
-      </w:r>
-      <w:r>
-        <w:t xml:space="preserve">‘Distinguished Professor, ICAS-2026 Bangkok keynote speaker olarak seçildiniz, 12.000 araştırmacı arasından.’</w:t>
-      </w:r>
-      <w:r>
-        <w:t xml:space="preserve"> </w:t>
-      </w:r>
-      <w:r>
-        <w:t xml:space="preserve">695 dolar kayıt. Vampir konferans — gerçek konferanslar</w:t>
-      </w:r>
-      <w:r>
-        <w:t xml:space="preserve"> </w:t>
-      </w:r>
-      <w:r>
-        <w:t xml:space="preserve">‘random keynote’</w:t>
-      </w:r>
-      <w:r>
-        <w:t xml:space="preserve"> </w:t>
-      </w:r>
-      <w:r>
-        <w:t xml:space="preserve">daveti yollamaz. Bangkok / Dubai / Roma odalı konferansların çoğu paid-talk fabrikası, ÜAK saymaz. Kontrol: think.checksubmit.org, WikiCFP.”</w:t>
+        <w:t xml:space="preserve">“WhatsApp’ta gelen bir mesaj canlanıyor.</w:t>
+      </w:r>
+      <w:r>
+        <w:t xml:space="preserve"> </w:t>
+      </w:r>
+      <w:r>
+        <w:t xml:space="preserve">‘TikTok ajansından arıyoruz’</w:t>
+      </w:r>
+      <w:r>
+        <w:t xml:space="preserve">,</w:t>
+      </w:r>
+      <w:r>
+        <w:t xml:space="preserve"> </w:t>
+      </w:r>
+      <w:r>
+        <w:t xml:space="preserve">‘günde 800–2500 TL’</w:t>
+      </w:r>
+      <w:r>
+        <w:t xml:space="preserve">,</w:t>
+      </w:r>
+      <w:r>
+        <w:t xml:space="preserve"> </w:t>
+      </w:r>
+      <w:r>
+        <w:t xml:space="preserve">‘ilk göreve başlamak için: bit.ly/…’</w:t>
+      </w:r>
+      <w:r>
+        <w:t xml:space="preserve">. Sen</w:t>
+      </w:r>
+      <w:r>
+        <w:t xml:space="preserve"> </w:t>
+      </w:r>
+      <w:r>
+        <w:t xml:space="preserve">‘tmm bakayım’</w:t>
+      </w:r>
+      <w:r>
+        <w:t xml:space="preserve"> </w:t>
+      </w:r>
+      <w:r>
+        <w:t xml:space="preserve">diyorsun — beş saniye sonra</w:t>
+      </w:r>
+      <w:r>
+        <w:t xml:space="preserve"> </w:t>
+      </w:r>
+      <w:r>
+        <w:t xml:space="preserve">‘250 TL kazandın! 5.000 TL teminat yatır’</w:t>
+      </w:r>
+      <w:r>
+        <w:t xml:space="preserve">.</w:t>
+      </w:r>
+      <w:r>
+        <w:t xml:space="preserve"> </w:t>
+      </w:r>
+      <w:r>
+        <w:rPr>
+          <w:b/>
+          <w:bCs/>
+        </w:rPr>
+        <w:t xml:space="preserve">İşte tam burada hesabın çalınıyor.</w:t>
+      </w:r>
+      <w:r>
+        <w:t xml:space="preserve"> </w:t>
+      </w:r>
+      <w:r>
+        <w:t xml:space="preserve">Linke tıkladığın an WhatsApp QR girişin saldırgana geçti,</w:t>
+      </w:r>
+      <w:r>
+        <w:t xml:space="preserve"> </w:t>
+      </w:r>
+      <w:r>
+        <w:rPr>
+          <w:b/>
+          <w:bCs/>
+        </w:rPr>
+        <w:t xml:space="preserve">347 arkadaşın şu anda aynı mesajı senden alıyor.</w:t>
+      </w:r>
+      <w:r>
+        <w:t xml:space="preserve"> </w:t>
+      </w:r>
+      <w:r>
+        <w:t xml:space="preserve">Tek tıklama, bütün ağ.”</w:t>
+      </w:r>
+    </w:p>
+    <w:p>
+      <w:pPr>
+        <w:pStyle w:val="FirstParagraph"/>
+      </w:pPr>
+      <w:r>
+        <w:rPr>
+          <w:b/>
+          <w:bCs/>
+        </w:rPr>
+        <w:t xml:space="preserve">Yapılacak:</w:t>
+      </w:r>
+      <w:r>
+        <w:t xml:space="preserve"> </w:t>
+      </w:r>
+      <w:r>
+        <w:t xml:space="preserve">Mesajlar sırayla yazılır, sonra otomatik kırmızı reveal. Sen reveal’a kadar sus.</w:t>
       </w:r>
     </w:p>
     <w:p>
@@ -1950,13 +1999,13 @@
       </w:r>
     </w:p>
     <w:bookmarkEnd w:id="30"/>
-    <w:bookmarkStart w:id="31" w:name="slayt-20-yök-burs-bildirimi"/>
+    <w:bookmarkStart w:id="31" w:name="slayt-20-vishing-sahte-savcılık-araması"/>
     <w:p>
       <w:pPr>
         <w:pStyle w:val="Heading3"/>
       </w:pPr>
       <w:r>
-        <w:t xml:space="preserve">Slayt 20 · YÖK Burs Bildirimi</w:t>
+        <w:t xml:space="preserve">Slayt 20 · Vishing · Sahte Savcılık Araması</w:t>
       </w:r>
     </w:p>
     <w:p>
@@ -1964,13 +2013,13 @@
         <w:pStyle w:val="BlockText"/>
       </w:pPr>
       <w:r>
-        <w:t xml:space="preserve">“Öğrenciler için:</w:t>
-      </w:r>
-      <w:r>
-        <w:t xml:space="preserve"> </w:t>
-      </w:r>
-      <w:r>
-        <w:t xml:space="preserve">‘bilgi@yok-burs2026.gov-tr.com’</w:t>
+        <w:t xml:space="preserve">“Telefon çalıyor: Ankara Cumhuriyet Başsavcılığı. Açıyoruz.</w:t>
+      </w:r>
+      <w:r>
+        <w:t xml:space="preserve"> </w:t>
+      </w:r>
+      <w:r>
+        <w:t xml:space="preserve">‘İyi günler, ben Komiser Yılmaz’</w:t>
       </w:r>
       <w:r>
         <w:t xml:space="preserve"> </w:t>
@@ -1982,32 +2031,130 @@
         <w:t xml:space="preserve"> </w:t>
       </w:r>
       <w:r>
-        <w:t xml:space="preserve">‘yok-burs2026.</w:t>
-      </w:r>
-      <w:r>
-        <w:rPr>
-          <w:b/>
-          <w:bCs/>
-        </w:rPr>
-        <w:t xml:space="preserve">gov-tr.com</w:t>
-      </w:r>
-      <w:r>
-        <w:t xml:space="preserve">’</w:t>
-      </w:r>
-      <w:r>
-        <w:t xml:space="preserve">. Gerçek resmi alan yok.gov.tr veya kyk.gov.tr.</w:t>
-      </w:r>
-      <w:r>
-        <w:t xml:space="preserve"> </w:t>
-      </w:r>
-      <w:r>
-        <w:t xml:space="preserve">‘Aylık 5.800 TL burs onaylandı, 49,90 TL doğrulama hizmet bedeli.’</w:t>
-      </w:r>
-      <w:r>
-        <w:t xml:space="preserve"> </w:t>
-      </w:r>
-      <w:r>
-        <w:t xml:space="preserve">YÖK / KYK burs doğrulaması için ücret istemez. Tek kanal: e-Devlet, KYK uygulaması, 444 1 962.”</w:t>
+        <w:rPr>
+          <w:b/>
+          <w:bCs/>
+        </w:rPr>
+        <w:t xml:space="preserve">OTORİTE</w:t>
+      </w:r>
+      <w:r>
+        <w:t xml:space="preserve">.</w:t>
+      </w:r>
+      <w:r>
+        <w:t xml:space="preserve"> </w:t>
+      </w:r>
+      <w:r>
+        <w:t xml:space="preserve">‘Adınıza açılmış bir soruşturma var’</w:t>
+      </w:r>
+      <w:r>
+        <w:t xml:space="preserve"> </w:t>
+      </w:r>
+      <w:r>
+        <w:t xml:space="preserve">—</w:t>
+      </w:r>
+      <w:r>
+        <w:t xml:space="preserve"> </w:t>
+      </w:r>
+      <w:r>
+        <w:rPr>
+          <w:b/>
+          <w:bCs/>
+        </w:rPr>
+        <w:t xml:space="preserve">KORKU</w:t>
+      </w:r>
+      <w:r>
+        <w:t xml:space="preserve">.</w:t>
+      </w:r>
+      <w:r>
+        <w:t xml:space="preserve"> </w:t>
+      </w:r>
+      <w:r>
+        <w:t xml:space="preserve">‘15 dakika içinde’</w:t>
+      </w:r>
+      <w:r>
+        <w:t xml:space="preserve"> </w:t>
+      </w:r>
+      <w:r>
+        <w:t xml:space="preserve">—</w:t>
+      </w:r>
+      <w:r>
+        <w:t xml:space="preserve"> </w:t>
+      </w:r>
+      <w:r>
+        <w:rPr>
+          <w:b/>
+          <w:bCs/>
+        </w:rPr>
+        <w:t xml:space="preserve">ACİLİYET</w:t>
+      </w:r>
+      <w:r>
+        <w:t xml:space="preserve">.</w:t>
+      </w:r>
+      <w:r>
+        <w:t xml:space="preserve"> </w:t>
+      </w:r>
+      <w:r>
+        <w:t xml:space="preserve">‘Bu görüşme gizli’</w:t>
+      </w:r>
+      <w:r>
+        <w:t xml:space="preserve"> </w:t>
+      </w:r>
+      <w:r>
+        <w:t xml:space="preserve">—</w:t>
+      </w:r>
+      <w:r>
+        <w:t xml:space="preserve"> </w:t>
+      </w:r>
+      <w:r>
+        <w:rPr>
+          <w:b/>
+          <w:bCs/>
+        </w:rPr>
+        <w:t xml:space="preserve">İZOLASYON</w:t>
+      </w:r>
+      <w:r>
+        <w:t xml:space="preserve">.</w:t>
+      </w:r>
+      <w:r>
+        <w:t xml:space="preserve"> </w:t>
+      </w:r>
+      <w:r>
+        <w:t xml:space="preserve">‘Tüm paranızı emanet hesabına aktarın’</w:t>
+      </w:r>
+      <w:r>
+        <w:t xml:space="preserve"> </w:t>
+      </w:r>
+      <w:r>
+        <w:t xml:space="preserve">—</w:t>
+      </w:r>
+      <w:r>
+        <w:t xml:space="preserve"> </w:t>
+      </w:r>
+      <w:r>
+        <w:rPr>
+          <w:b/>
+          <w:bCs/>
+        </w:rPr>
+        <w:t xml:space="preserve">VURGUN</w:t>
+      </w:r>
+      <w:r>
+        <w:t xml:space="preserve">. Beş silah, beş cümle. Devlet asla telefonda para istemez. Kapat — banka ve aile numaralarını</w:t>
+      </w:r>
+      <w:r>
+        <w:t xml:space="preserve"> </w:t>
+      </w:r>
+      <w:r>
+        <w:rPr>
+          <w:b/>
+          <w:bCs/>
+        </w:rPr>
+        <w:t xml:space="preserve">kendin</w:t>
+      </w:r>
+      <w:r>
+        <w:t xml:space="preserve"> </w:t>
+      </w:r>
+      <w:r>
+        <w:t xml:space="preserve">ara.”</w:t>
       </w:r>
     </w:p>
     <w:p>
@@ -2018,13 +2165,13 @@
       </w:r>
     </w:p>
     <w:bookmarkEnd w:id="31"/>
-    <w:bookmarkStart w:id="32" w:name="slayt-21-hangisi-gerçek-dergi"/>
+    <w:bookmarkStart w:id="32" w:name="slayt-21-predatory-dergi"/>
     <w:p>
       <w:pPr>
         <w:pStyle w:val="Heading3"/>
       </w:pPr>
       <w:r>
-        <w:t xml:space="preserve">Slayt 21 · Hangisi Gerçek Dergi?</w:t>
+        <w:t xml:space="preserve">Slayt 21 · Predatory Dergi</w:t>
       </w:r>
     </w:p>
     <w:p>
@@ -2032,72 +2179,53 @@
         <w:pStyle w:val="BlockText"/>
       </w:pPr>
       <w:r>
-        <w:t xml:space="preserve">“İki dergi yan yana. Solda</w:t>
-      </w:r>
-      <w:r>
-        <w:t xml:space="preserve"> </w:t>
-      </w:r>
-      <w:r>
-        <w:t xml:space="preserve">‘International Journal of Advanced Research’</w:t>
-      </w:r>
-      <w:r>
-        <w:t xml:space="preserve"> </w:t>
-      </w:r>
-      <w:r>
-        <w:t xml:space="preserve">IJAR Publishing Ltd, Mauritius merkezli, RIIF 8,4, 18 saat hakem, 349 dolar APC. Sağda</w:t>
-      </w:r>
-      <w:r>
-        <w:t xml:space="preserve"> </w:t>
-      </w:r>
-      <w:r>
-        <w:t xml:space="preserve">‘IEEE Transactions on Information Forensics and Security’</w:t>
-      </w:r>
-      <w:r>
-        <w:t xml:space="preserve"> </w:t>
-      </w:r>
-      <w:r>
-        <w:t xml:space="preserve">Web of Science Q1, 6,8 IF, 3–6 ay hakem, açık erişim opsiyonel. Hangisi gerçek? Üçüncü saniyede kırmızı çarpılar parlar, beşinci saniyede stamp düşer.</w:t>
-      </w:r>
-      <w:r>
-        <w:t xml:space="preserve"> </w:t>
-      </w:r>
-      <w:r>
-        <w:rPr>
-          <w:b/>
-          <w:bCs/>
-        </w:rPr>
-        <w:t xml:space="preserve">Gerçek dergi:</w:t>
-      </w:r>
-      <w:r>
-        <w:t xml:space="preserve"> </w:t>
-      </w:r>
-      <w:r>
-        <w:t xml:space="preserve">tanınır yayıncı, tanınır indeks, aylar süren çift-kör hakem, şeffaf ücret.</w:t>
-      </w:r>
-      <w:r>
-        <w:t xml:space="preserve"> </w:t>
-      </w:r>
-      <w:r>
-        <w:rPr>
-          <w:b/>
-          <w:bCs/>
-        </w:rPr>
-        <w:t xml:space="preserve">Predatory:</w:t>
-      </w:r>
-      <w:r>
-        <w:t xml:space="preserve"> </w:t>
-      </w:r>
-      <w:r>
-        <w:t xml:space="preserve">uydurma indeks adı, saatler içinde</w:t>
-      </w:r>
-      <w:r>
-        <w:t xml:space="preserve"> </w:t>
-      </w:r>
-      <w:r>
-        <w:t xml:space="preserve">‘kabul’</w:t>
-      </w:r>
-      <w:r>
-        <w:t xml:space="preserve">, peşin yayın ücreti.”</w:t>
+        <w:t xml:space="preserve">“Akademisyenler dinliyor. Mail kutusu:</w:t>
+      </w:r>
+      <w:r>
+        <w:t xml:space="preserve"> </w:t>
+      </w:r>
+      <w:r>
+        <w:t xml:space="preserve">‘editor@ijar-publishing.net’</w:t>
+      </w:r>
+      <w:r>
+        <w:t xml:space="preserve"> </w:t>
+      </w:r>
+      <w:r>
+        <w:t xml:space="preserve">—</w:t>
+      </w:r>
+      <w:r>
+        <w:t xml:space="preserve"> </w:t>
+      </w:r>
+      <w:r>
+        <w:t xml:space="preserve">‘manuscript ACCEPTED’</w:t>
+      </w:r>
+      <w:r>
+        <w:t xml:space="preserve">. 18 saatte hakem onayı — bu süre hakem değil, kredi kartı bekleme süresi. RIIF 8,4</w:t>
+      </w:r>
+      <w:r>
+        <w:t xml:space="preserve"> </w:t>
+      </w:r>
+      <w:r>
+        <w:t xml:space="preserve">‘impact factor’</w:t>
+      </w:r>
+      <w:r>
+        <w:t xml:space="preserve"> </w:t>
+      </w:r>
+      <w:r>
+        <w:t xml:space="preserve">— uydurma. 349 dolar yayın ücreti. Ödeyenin makalesi</w:t>
+      </w:r>
+      <w:r>
+        <w:t xml:space="preserve"> </w:t>
+      </w:r>
+      <w:r>
+        <w:rPr>
+          <w:b/>
+          <w:bCs/>
+        </w:rPr>
+        <w:t xml:space="preserve">akademik özgeçmişe sayılmaz</w:t>
+      </w:r>
+      <w:r>
+        <w:t xml:space="preserve">, ÜAK reddeder. Kontrol kanalı: DOAJ, Beall’s List, ULAKBİM TR-Dizin.”</w:t>
       </w:r>
     </w:p>
     <w:p>
@@ -2108,13 +2236,13 @@
       </w:r>
     </w:p>
     <w:bookmarkEnd w:id="32"/>
-    <w:bookmarkStart w:id="33" w:name="slayt-22-ceo-vurgunu-whaling"/>
+    <w:bookmarkStart w:id="33" w:name="slayt-22-sahte-konferans-davetiyesi"/>
     <w:p>
       <w:pPr>
         <w:pStyle w:val="Heading3"/>
       </w:pPr>
       <w:r>
-        <w:t xml:space="preserve">Slayt 22 · CEO Vurgunu · Whaling</w:t>
+        <w:t xml:space="preserve">Slayt 22 · Sahte Konferans Davetiyesi</w:t>
       </w:r>
     </w:p>
     <w:p>
@@ -2122,35 +2250,31 @@
         <w:pStyle w:val="BlockText"/>
       </w:pPr>
       <w:r>
-        <w:t xml:space="preserve">“Şirketin muhasebe çalışanına gelen mail.</w:t>
-      </w:r>
-      <w:r>
-        <w:t xml:space="preserve"> </w:t>
-      </w:r>
-      <w:r>
-        <w:t xml:space="preserve">‘Sevgili Ahmet, bugün öğleden önce 38.500 TL transfer halletmen lazım. Avukatla görüşmedeyim, telefonda erişimim yok. Sadece sana güveniyorum. Kimseyle paylaşma.’</w:t>
-      </w:r>
-      <w:r>
-        <w:t xml:space="preserve"> </w:t>
-      </w:r>
-      <w:r>
-        <w:t xml:space="preserve">İmza CEO. Bu kalıba Whaling diyoruz.</w:t>
-      </w:r>
-      <w:r>
-        <w:t xml:space="preserve"> </w:t>
-      </w:r>
-      <w:r>
-        <w:rPr>
-          <w:b/>
-          <w:bCs/>
-        </w:rPr>
-        <w:t xml:space="preserve">Acil + Gizli + Nakit</w:t>
-      </w:r>
-      <w:r>
-        <w:t xml:space="preserve"> </w:t>
-      </w:r>
-      <w:r>
-        <w:t xml:space="preserve">üçü birden — telefonla yöneticiyi DOĞRULA. Hong Kong’da Arup şirketi 2024’te bu yolla 25,6 milyon dolar kaybetti.”</w:t>
+        <w:t xml:space="preserve">“Aynı kalıp konferans için.</w:t>
+      </w:r>
+      <w:r>
+        <w:t xml:space="preserve"> </w:t>
+      </w:r>
+      <w:r>
+        <w:t xml:space="preserve">‘Distinguished Professor, ICAS-2026 Bangkok keynote speaker olarak seçildiniz, 12.000 araştırmacı arasından.’</w:t>
+      </w:r>
+      <w:r>
+        <w:t xml:space="preserve"> </w:t>
+      </w:r>
+      <w:r>
+        <w:t xml:space="preserve">695 dolar kayıt. Vampir konferans — gerçek konferanslar</w:t>
+      </w:r>
+      <w:r>
+        <w:t xml:space="preserve"> </w:t>
+      </w:r>
+      <w:r>
+        <w:t xml:space="preserve">‘random keynote’</w:t>
+      </w:r>
+      <w:r>
+        <w:t xml:space="preserve"> </w:t>
+      </w:r>
+      <w:r>
+        <w:t xml:space="preserve">daveti yollamaz. Bangkok / Dubai / Roma odalı konferansların çoğu paid-talk fabrikası, ÜAK saymaz. Kontrol: think.checksubmit.org, WikiCFP.”</w:t>
       </w:r>
     </w:p>
     <w:p>
@@ -2161,13 +2285,13 @@
       </w:r>
     </w:p>
     <w:bookmarkEnd w:id="33"/>
-    <w:bookmarkStart w:id="34" w:name="slayt-23-altın-kural"/>
+    <w:bookmarkStart w:id="34" w:name="slayt-23-yök-burs-bildirimi"/>
     <w:p>
       <w:pPr>
         <w:pStyle w:val="Heading3"/>
       </w:pPr>
       <w:r>
-        <w:t xml:space="preserve">Slayt 23 · Altın Kural</w:t>
+        <w:t xml:space="preserve">Slayt 23 · YÖK Burs Bildirimi</w:t>
       </w:r>
     </w:p>
     <w:p>
@@ -2175,23 +2299,63 @@
         <w:pStyle w:val="BlockText"/>
       </w:pPr>
       <w:r>
-        <w:t xml:space="preserve">“Bu cümle hayat kurtarır:</w:t>
-      </w:r>
-      <w:r>
-        <w:t xml:space="preserve"> </w:t>
-      </w:r>
-      <w:r>
-        <w:rPr>
-          <w:b/>
-          <w:bCs/>
-        </w:rPr>
-        <w:t xml:space="preserve">Devlet asla telefonda para, altın veya şifre istemez.</w:t>
-      </w:r>
-      <w:r>
-        <w:t xml:space="preserve"> </w:t>
-      </w:r>
-      <w:r>
-        <w:t xml:space="preserve">Bu cümleyi öğretin — annenize, babaanenize, çocuğunuza. 60 yaş üstü ve 18-24 yaş ayrı demez — herkes düşüyor.”</w:t>
+        <w:t xml:space="preserve">“Öğrenciler için:</w:t>
+      </w:r>
+      <w:r>
+        <w:t xml:space="preserve"> </w:t>
+      </w:r>
+      <w:r>
+        <w:t xml:space="preserve">‘bilgi@yok-burs2026.gov-tr.com’</w:t>
+      </w:r>
+      <w:r>
+        <w:t xml:space="preserve"> </w:t>
+      </w:r>
+      <w:r>
+        <w:t xml:space="preserve">—</w:t>
+      </w:r>
+      <w:r>
+        <w:t xml:space="preserve"> </w:t>
+      </w:r>
+      <w:r>
+        <w:t xml:space="preserve">‘yok-burs2026.</w:t>
+      </w:r>
+      <w:r>
+        <w:rPr>
+          <w:b/>
+          <w:bCs/>
+        </w:rPr>
+        <w:t xml:space="preserve">gov-tr.com</w:t>
+      </w:r>
+      <w:r>
+        <w:t xml:space="preserve">’</w:t>
+      </w:r>
+      <w:r>
+        <w:t xml:space="preserve">. Gerçek resmi alan yok.gov.tr veya kyk.gov.tr.</w:t>
+      </w:r>
+      <w:r>
+        <w:t xml:space="preserve"> </w:t>
+      </w:r>
+      <w:r>
+        <w:t xml:space="preserve">‘Aylık 5.800 TL burs, 49,90 TL doğrulama hizmet bedeli.’</w:t>
+      </w:r>
+      <w:r>
+        <w:t xml:space="preserve"> </w:t>
+      </w:r>
+      <w:r>
+        <w:t xml:space="preserve">YÖK / KYK burs doğrulaması için</w:t>
+      </w:r>
+      <w:r>
+        <w:t xml:space="preserve"> </w:t>
+      </w:r>
+      <w:r>
+        <w:rPr>
+          <w:b/>
+          <w:bCs/>
+        </w:rPr>
+        <w:t xml:space="preserve">ücret istemez</w:t>
+      </w:r>
+      <w:r>
+        <w:t xml:space="preserve">. Tek kanal: e-Devlet, KYK uygulaması, 444 1 962.”</w:t>
       </w:r>
     </w:p>
     <w:p>
@@ -2202,29 +2366,13 @@
       </w:r>
     </w:p>
     <w:bookmarkEnd w:id="34"/>
-    <w:bookmarkEnd w:id="35"/>
-    <w:bookmarkStart w:id="41" w:name="bölüm-5-2026-tehditleri"/>
-    <w:p>
-      <w:pPr>
-        <w:pStyle w:val="Heading2"/>
-      </w:pPr>
-      <w:r>
-        <w:t xml:space="preserve">BÖLÜM 5 · 2026 TEHDİTLERİ</w:t>
-      </w:r>
-    </w:p>
-    <w:bookmarkStart w:id="36" w:name="X8c7a85635e77cf41bc470f43323589199e615be"/>
+    <w:bookmarkStart w:id="35" w:name="slayt-24-hangisi-gerçek-dergi"/>
     <w:p>
       <w:pPr>
         <w:pStyle w:val="Heading3"/>
       </w:pPr>
       <w:r>
-        <w:t xml:space="preserve">Slayt 24 · Deepfake ·</w:t>
-      </w:r>
-      <w:r>
-        <w:t xml:space="preserve"> </w:t>
-      </w:r>
-      <w:r>
-        <w:t xml:space="preserve">“Bu Morgan Freeman değil”</w:t>
+        <w:t xml:space="preserve">Slayt 24 · Hangisi Gerçek Dergi?</w:t>
       </w:r>
     </w:p>
     <w:p>
@@ -2232,102 +2380,72 @@
         <w:pStyle w:val="BlockText"/>
       </w:pPr>
       <w:r>
-        <w:t xml:space="preserve">“Şimdi videoyu izleyelim. … [video oynar] … Evet, bu Morgan Freeman</w:t>
-      </w:r>
-      <w:r>
-        <w:t xml:space="preserve"> </w:t>
-      </w:r>
-      <w:r>
-        <w:rPr>
-          <w:b/>
-          <w:bCs/>
-        </w:rPr>
-        <w:t xml:space="preserve">değildi</w:t>
-      </w:r>
-      <w:r>
-        <w:t xml:space="preserve">. Yapay zekâ. Hong Kong’da Arup şirketinin bir çalışanı CFO ve yöneticilerle video konferansa katıldı — odadaki</w:t>
-      </w:r>
-      <w:r>
-        <w:t xml:space="preserve"> </w:t>
-      </w:r>
-      <w:r>
-        <w:rPr>
-          <w:b/>
-          <w:bCs/>
-        </w:rPr>
-        <w:t xml:space="preserve">herkes deepfake’ti</w:t>
-      </w:r>
-      <w:r>
-        <w:t xml:space="preserve"> </w:t>
-      </w:r>
-      <w:r>
-        <w:t xml:space="preserve">— 15 transferde 25,6 milyon dolar gitti. Türkiye’de MİT, Cumhurbaşkanı’nın ses klonunu kullanan kişiyi yakaladı. Nasıl anlarsın? Üç ipucu var:</w:t>
-      </w:r>
-      <w:r>
-        <w:t xml:space="preserve"> </w:t>
-      </w:r>
-      <w:r>
-        <w:rPr>
-          <w:b/>
-          <w:bCs/>
-        </w:rPr>
-        <w:t xml:space="preserve">göz</w:t>
-      </w:r>
-      <w:r>
-        <w:t xml:space="preserve"> </w:t>
-      </w:r>
-      <w:r>
-        <w:t xml:space="preserve">kırpma anormal,</w:t>
-      </w:r>
-      <w:r>
-        <w:t xml:space="preserve"> </w:t>
-      </w:r>
-      <w:r>
-        <w:rPr>
-          <w:b/>
-          <w:bCs/>
-        </w:rPr>
-        <w:t xml:space="preserve">dudak senkronu</w:t>
-      </w:r>
-      <w:r>
-        <w:t xml:space="preserve"> </w:t>
-      </w:r>
-      <w:r>
-        <w:t xml:space="preserve">sert ünsüzlerde milisaniyelik kayar,</w:t>
-      </w:r>
-      <w:r>
-        <w:t xml:space="preserve"> </w:t>
-      </w:r>
-      <w:r>
-        <w:rPr>
-          <w:b/>
-          <w:bCs/>
-        </w:rPr>
-        <w:t xml:space="preserve">ton ve nefes</w:t>
-      </w:r>
-      <w:r>
-        <w:t xml:space="preserve"> </w:t>
-      </w:r>
-      <w:r>
-        <w:t xml:space="preserve">klonlanmış seste eksiktir.”</w:t>
-      </w:r>
-    </w:p>
-    <w:p>
-      <w:pPr>
-        <w:pStyle w:val="FirstParagraph"/>
-      </w:pPr>
-      <w:r>
-        <w:rPr>
-          <w:b/>
-          <w:bCs/>
-        </w:rPr>
-        <w:t xml:space="preserve">Yapılacak:</w:t>
-      </w:r>
-      <w:r>
-        <w:t xml:space="preserve"> </w:t>
-      </w:r>
-      <w:r>
-        <w:t xml:space="preserve">Video başlat. ~2 dakika oynat. Sonra 3 ipucu üzerine konuş.</w:t>
+        <w:t xml:space="preserve">“İki dergi yan yana. Solda</w:t>
+      </w:r>
+      <w:r>
+        <w:t xml:space="preserve"> </w:t>
+      </w:r>
+      <w:r>
+        <w:t xml:space="preserve">‘International Journal of Advanced Research’</w:t>
+      </w:r>
+      <w:r>
+        <w:t xml:space="preserve"> </w:t>
+      </w:r>
+      <w:r>
+        <w:t xml:space="preserve">Mauritius, RIIF 8,4, 18 saat hakem, 349 dolar APC. Sağda</w:t>
+      </w:r>
+      <w:r>
+        <w:t xml:space="preserve"> </w:t>
+      </w:r>
+      <w:r>
+        <w:t xml:space="preserve">‘IEEE Transactions’</w:t>
+      </w:r>
+      <w:r>
+        <w:t xml:space="preserve"> </w:t>
+      </w:r>
+      <w:r>
+        <w:t xml:space="preserve">Web of Science Q1, 6,8 IF, 3–6 ay hakem, açık erişim opsiyonel. Hangisi gerçek? …</w:t>
+      </w:r>
+      <w:r>
+        <w:t xml:space="preserve"> </w:t>
+      </w:r>
+      <w:r>
+        <w:rPr>
+          <w:b/>
+          <w:bCs/>
+        </w:rPr>
+        <w:t xml:space="preserve">Gerçek dergi:</w:t>
+      </w:r>
+      <w:r>
+        <w:t xml:space="preserve"> </w:t>
+      </w:r>
+      <w:r>
+        <w:t xml:space="preserve">tanınır yayıncı, tanınır indeks, aylar süren çift-kör hakem, şeffaf ücret.</w:t>
+      </w:r>
+      <w:r>
+        <w:t xml:space="preserve"> </w:t>
+      </w:r>
+      <w:r>
+        <w:rPr>
+          <w:b/>
+          <w:bCs/>
+        </w:rPr>
+        <w:t xml:space="preserve">Predatory:</w:t>
+      </w:r>
+      <w:r>
+        <w:t xml:space="preserve"> </w:t>
+      </w:r>
+      <w:r>
+        <w:t xml:space="preserve">uydurma indeks, saatler içinde</w:t>
+      </w:r>
+      <w:r>
+        <w:t xml:space="preserve"> </w:t>
+      </w:r>
+      <w:r>
+        <w:t xml:space="preserve">‘kabul’</w:t>
+      </w:r>
+      <w:r>
+        <w:t xml:space="preserve">, peşin ücret.”</w:t>
       </w:r>
     </w:p>
     <w:p>
@@ -2337,14 +2455,14 @@
         </w:pict>
       </w:r>
     </w:p>
-    <w:bookmarkEnd w:id="36"/>
-    <w:bookmarkStart w:id="37" w:name="slayt-25-canlı-saldırı-haritası"/>
+    <w:bookmarkEnd w:id="35"/>
+    <w:bookmarkStart w:id="36" w:name="slayt-25-ceo-vurgunu-whaling"/>
     <w:p>
       <w:pPr>
         <w:pStyle w:val="Heading3"/>
       </w:pPr>
       <w:r>
-        <w:t xml:space="preserve">Slayt 25 · Canlı Saldırı Haritası</w:t>
+        <w:t xml:space="preserve">Slayt 25 · CEO Vurgunu · Whaling</w:t>
       </w:r>
     </w:p>
     <w:p>
@@ -2352,25 +2470,51 @@
         <w:pStyle w:val="BlockText"/>
       </w:pPr>
       <w:r>
-        <w:t xml:space="preserve">“İşte şu an Türkiye haritası. Her saniye bir şehir yanıyor — Phishing, Ransomware, DDoS, Brute-Force, Deepfake, SMS-Phish. Sağda canlı log. USOM verisi günde 11 milyon engelleme — bu görüntü, bu ekran, gerçeği temsil ediyor. Saldırı dinmiyor.”</w:t>
-      </w:r>
-    </w:p>
-    <w:p>
-      <w:pPr>
-        <w:pStyle w:val="FirstParagraph"/>
-      </w:pPr>
-      <w:r>
-        <w:rPr>
-          <w:b/>
-          <w:bCs/>
-        </w:rPr>
-        <w:t xml:space="preserve">Yapılacak:</w:t>
-      </w:r>
-      <w:r>
-        <w:t xml:space="preserve"> </w:t>
-      </w:r>
-      <w:r>
-        <w:t xml:space="preserve">30 saniye saldırıları say. Sayaç ve log akmaya devam ediyor.</w:t>
+        <w:t xml:space="preserve">“Şirket muhasebe çalışanına gelen mail.</w:t>
+      </w:r>
+      <w:r>
+        <w:t xml:space="preserve"> </w:t>
+      </w:r>
+      <w:r>
+        <w:t xml:space="preserve">‘Sevgili Ahmet, bugün öğleden önce 38.500 TL transfer halletmen lazım. Sadece sana güveniyorum, kimseyle paylaşma.’</w:t>
+      </w:r>
+      <w:r>
+        <w:t xml:space="preserve"> </w:t>
+      </w:r>
+      <w:r>
+        <w:t xml:space="preserve">İmza CEO.</w:t>
+      </w:r>
+      <w:r>
+        <w:t xml:space="preserve"> </w:t>
+      </w:r>
+      <w:r>
+        <w:rPr>
+          <w:b/>
+          <w:bCs/>
+        </w:rPr>
+        <w:t xml:space="preserve">Acil + Gizli + Nakit</w:t>
+      </w:r>
+      <w:r>
+        <w:t xml:space="preserve"> </w:t>
+      </w:r>
+      <w:r>
+        <w:t xml:space="preserve">üçü birden — telefonla yöneticiyi DOĞRULA. Hong Kong’da Arup 2024’te bu yolla</w:t>
+      </w:r>
+      <w:r>
+        <w:t xml:space="preserve"> </w:t>
+      </w:r>
+      <w:r>
+        <w:rPr>
+          <w:b/>
+          <w:bCs/>
+        </w:rPr>
+        <w:t xml:space="preserve">25,6 milyon dolar</w:t>
+      </w:r>
+      <w:r>
+        <w:t xml:space="preserve"> </w:t>
+      </w:r>
+      <w:r>
+        <w:t xml:space="preserve">kaybetti.”</w:t>
       </w:r>
     </w:p>
     <w:p>
@@ -2380,14 +2524,14 @@
         </w:pict>
       </w:r>
     </w:p>
-    <w:bookmarkEnd w:id="37"/>
-    <w:bookmarkStart w:id="38" w:name="slayt-26-qr-phishing-bait-canli"/>
+    <w:bookmarkEnd w:id="36"/>
+    <w:bookmarkStart w:id="37" w:name="slayt-26-altın-kural"/>
     <w:p>
       <w:pPr>
         <w:pStyle w:val="Heading3"/>
       </w:pPr>
       <w:r>
-        <w:t xml:space="preserve">Slayt 26 · QR Phishing · Bait (CANLI)</w:t>
+        <w:t xml:space="preserve">Slayt 26 · Altın Kural</w:t>
       </w:r>
     </w:p>
     <w:p>
@@ -2395,65 +2539,23 @@
         <w:pStyle w:val="BlockText"/>
       </w:pPr>
       <w:r>
-        <w:t xml:space="preserve">“Sıra geldi en sevdiğim deneye. Telefonunu çıkar, QR’ı tarat.</w:t>
-      </w:r>
-      <w:r>
-        <w:t xml:space="preserve"> </w:t>
-      </w:r>
-      <w:r>
-        <w:rPr>
-          <w:b/>
-          <w:bCs/>
-        </w:rPr>
-        <w:t xml:space="preserve">‘Değerlendirme ve Hediye Çekilişi’</w:t>
-      </w:r>
-      <w:r>
-        <w:t xml:space="preserve"> </w:t>
-      </w:r>
-      <w:r>
-        <w:t xml:space="preserve">— kısa anketi doldur, sürpriz hediye çekilişine katıl. Hemen tarat.”</w:t>
-      </w:r>
-    </w:p>
-    <w:p>
-      <w:pPr>
-        <w:pStyle w:val="FirstParagraph"/>
-      </w:pPr>
-      <w:r>
-        <w:rPr>
-          <w:b/>
-          <w:bCs/>
-        </w:rPr>
-        <w:t xml:space="preserve">Yapılacak:</w:t>
-      </w:r>
-      <w:r>
-        <w:t xml:space="preserve"> </w:t>
-      </w:r>
-      <w:r>
-        <w:t xml:space="preserve">30–60 saniye bekle. Sayaç gerçek zamanlı artar.</w:t>
-      </w:r>
-      <w:r>
-        <w:t xml:space="preserve"> </w:t>
-      </w:r>
-      <w:r>
-        <w:t xml:space="preserve">“X kişi katıldı”</w:t>
-      </w:r>
-      <w:r>
-        <w:t xml:space="preserve"> </w:t>
-      </w:r>
-      <w:r>
-        <w:t xml:space="preserve">yazısını göster,</w:t>
-      </w:r>
-      <w:r>
-        <w:t xml:space="preserve"> </w:t>
-      </w:r>
-      <w:r>
-        <w:t xml:space="preserve">“tarayan herkes anketi açtığını sanıyor — bir saniye sonra ne göreceğini göstereyim”</w:t>
-      </w:r>
-      <w:r>
-        <w:t xml:space="preserve"> </w:t>
-      </w:r>
-      <w:r>
-        <w:t xml:space="preserve">de, sonra boşluğa bas.</w:t>
+        <w:t xml:space="preserve">“Bu cümle hayat kurtarır:</w:t>
+      </w:r>
+      <w:r>
+        <w:t xml:space="preserve"> </w:t>
+      </w:r>
+      <w:r>
+        <w:rPr>
+          <w:b/>
+          <w:bCs/>
+        </w:rPr>
+        <w:t xml:space="preserve">Devlet asla telefonda para, altın veya şifre istemez.</w:t>
+      </w:r>
+      <w:r>
+        <w:t xml:space="preserve"> </w:t>
+      </w:r>
+      <w:r>
+        <w:t xml:space="preserve">Bu cümleyi öğretin — annenize, babaanenize, çocuğunuza.”</w:t>
       </w:r>
     </w:p>
     <w:p>
@@ -2463,14 +2565,30 @@
         </w:pict>
       </w:r>
     </w:p>
+    <w:bookmarkEnd w:id="37"/>
     <w:bookmarkEnd w:id="38"/>
-    <w:bookmarkStart w:id="39" w:name="slayt-27-qr-phishing-reveal"/>
+    <w:bookmarkStart w:id="49" w:name="bölüm-5-2026-tehditleri"/>
+    <w:p>
+      <w:pPr>
+        <w:pStyle w:val="Heading2"/>
+      </w:pPr>
+      <w:r>
+        <w:t xml:space="preserve">BÖLÜM 5 · 2026 TEHDİTLERİ</w:t>
+      </w:r>
+    </w:p>
+    <w:bookmarkStart w:id="39" w:name="X37a380c659abb0030319eab9e5664419bd72849"/>
     <w:p>
       <w:pPr>
         <w:pStyle w:val="Heading3"/>
       </w:pPr>
       <w:r>
-        <w:t xml:space="preserve">Slayt 27 · QR Phishing · Reveal</w:t>
+        <w:t xml:space="preserve">Slayt 27 · Deepfake ·</w:t>
+      </w:r>
+      <w:r>
+        <w:t xml:space="preserve"> </w:t>
+      </w:r>
+      <w:r>
+        <w:t xml:space="preserve">“Bu Morgan Freeman değil”</w:t>
       </w:r>
     </w:p>
     <w:p>
@@ -2478,51 +2596,102 @@
         <w:pStyle w:val="BlockText"/>
       </w:pPr>
       <w:r>
-        <w:t xml:space="preserve">“İşte sayı:</w:t>
-      </w:r>
-      <w:r>
-        <w:t xml:space="preserve"> </w:t>
-      </w:r>
-      <w:r>
-        <w:rPr>
-          <w:b/>
-          <w:bCs/>
-        </w:rPr>
-        <w:t xml:space="preserve">[X] kişi sahte bir QR’a güvendi.</w:t>
-      </w:r>
-      <w:r>
-        <w:t xml:space="preserve"> </w:t>
-      </w:r>
-      <w:r>
-        <w:t xml:space="preserve">Aslında anket falan yoktu. Tarayan herkes</w:t>
-      </w:r>
-      <w:r>
-        <w:t xml:space="preserve"> </w:t>
-      </w:r>
-      <w:r>
-        <w:t xml:space="preserve">‘VERİLERİNİZ ALINIYOR’</w:t>
-      </w:r>
-      <w:r>
-        <w:t xml:space="preserve"> </w:t>
-      </w:r>
-      <w:r>
-        <w:t xml:space="preserve">kırmızı ekranıyla karşılaştı — telefonunda gerçek cihaz bilgilerinizin alındığını gördünüz. Demoydu, hiçbir şey çalmadık.</w:t>
-      </w:r>
-      <w:r>
-        <w:t xml:space="preserve"> </w:t>
-      </w:r>
-      <w:r>
-        <w:rPr>
-          <w:b/>
-          <w:bCs/>
-        </w:rPr>
-        <w:t xml:space="preserve">Ama gerçek bir saldırgan QR’ı taradığın an bunu yapabilirdi.</w:t>
-      </w:r>
-      <w:r>
-        <w:t xml:space="preserve"> </w:t>
-      </w:r>
-      <w:r>
-        <w:t xml:space="preserve">QR = link. Tıklamadan önce nereye gittiğini kontrol et.”</w:t>
+        <w:t xml:space="preserve">“Şimdi videoyu izleyelim. … [video oynar] … Evet, bu Morgan Freeman</w:t>
+      </w:r>
+      <w:r>
+        <w:t xml:space="preserve"> </w:t>
+      </w:r>
+      <w:r>
+        <w:rPr>
+          <w:b/>
+          <w:bCs/>
+        </w:rPr>
+        <w:t xml:space="preserve">değildi</w:t>
+      </w:r>
+      <w:r>
+        <w:t xml:space="preserve">. Yapay zekâ. Hong Kong’da Arup şirketi video konferansta odadaki</w:t>
+      </w:r>
+      <w:r>
+        <w:t xml:space="preserve"> </w:t>
+      </w:r>
+      <w:r>
+        <w:rPr>
+          <w:b/>
+          <w:bCs/>
+        </w:rPr>
+        <w:t xml:space="preserve">herkes deepfake’ti</w:t>
+      </w:r>
+      <w:r>
+        <w:t xml:space="preserve"> </w:t>
+      </w:r>
+      <w:r>
+        <w:t xml:space="preserve">— 25,6 milyon dolar gitti. Türkiye’de MİT, Cumhurbaşkanı’nın ses klonunu yakaladı. Nasıl anlarsın?</w:t>
+      </w:r>
+      <w:r>
+        <w:t xml:space="preserve"> </w:t>
+      </w:r>
+      <w:r>
+        <w:rPr>
+          <w:b/>
+          <w:bCs/>
+        </w:rPr>
+        <w:t xml:space="preserve">Göz</w:t>
+      </w:r>
+      <w:r>
+        <w:t xml:space="preserve"> </w:t>
+      </w:r>
+      <w:r>
+        <w:t xml:space="preserve">kırpma anormal,</w:t>
+      </w:r>
+      <w:r>
+        <w:t xml:space="preserve"> </w:t>
+      </w:r>
+      <w:r>
+        <w:rPr>
+          <w:b/>
+          <w:bCs/>
+        </w:rPr>
+        <w:t xml:space="preserve">dudak senkronu</w:t>
+      </w:r>
+      <w:r>
+        <w:t xml:space="preserve"> </w:t>
+      </w:r>
+      <w:r>
+        <w:t xml:space="preserve">sert ünsüzlerde kayar,</w:t>
+      </w:r>
+      <w:r>
+        <w:t xml:space="preserve"> </w:t>
+      </w:r>
+      <w:r>
+        <w:rPr>
+          <w:b/>
+          <w:bCs/>
+        </w:rPr>
+        <w:t xml:space="preserve">ton ve nefes</w:t>
+      </w:r>
+      <w:r>
+        <w:t xml:space="preserve"> </w:t>
+      </w:r>
+      <w:r>
+        <w:t xml:space="preserve">klonlanmış seste eksiktir.”</w:t>
+      </w:r>
+    </w:p>
+    <w:p>
+      <w:pPr>
+        <w:pStyle w:val="FirstParagraph"/>
+      </w:pPr>
+      <w:r>
+        <w:rPr>
+          <w:b/>
+          <w:bCs/>
+        </w:rPr>
+        <w:t xml:space="preserve">Yapılacak:</w:t>
+      </w:r>
+      <w:r>
+        <w:t xml:space="preserve"> </w:t>
+      </w:r>
+      <w:r>
+        <w:t xml:space="preserve">Video başlat. ~2 dakika oynat. Sonra 3 ipucu üzerine konuş.</w:t>
       </w:r>
     </w:p>
     <w:p>
@@ -2533,13 +2702,13 @@
       </w:r>
     </w:p>
     <w:bookmarkEnd w:id="39"/>
-    <w:bookmarkStart w:id="40" w:name="slayt-28-ransomware-geri-sayım"/>
+    <w:bookmarkStart w:id="40" w:name="slayt-28-canlı-saldırı-haritası"/>
     <w:p>
       <w:pPr>
         <w:pStyle w:val="Heading3"/>
       </w:pPr>
       <w:r>
-        <w:t xml:space="preserve">Slayt 28 · Ransomware Geri Sayım</w:t>
+        <w:t xml:space="preserve">Slayt 28 · Canlı Saldırı Haritası</w:t>
       </w:r>
     </w:p>
     <w:p>
@@ -2547,23 +2716,7 @@
         <w:pStyle w:val="BlockText"/>
       </w:pPr>
       <w:r>
-        <w:t xml:space="preserve">“Şu ekrana bakın. CryptoLock-26 fidye yazılımı — verilerinizi şifreledi. Geri almak için 0.05 Bitcoin ödemeniz gerek — bugünkü kurda yaklaşık 50.000 dolar. Geri sayım bittiğinde fiyat</w:t>
-      </w:r>
-      <w:r>
-        <w:t xml:space="preserve"> </w:t>
-      </w:r>
-      <w:r>
-        <w:rPr>
-          <w:b/>
-          <w:bCs/>
-        </w:rPr>
-        <w:t xml:space="preserve">iki katı</w:t>
-      </w:r>
-      <w:r>
-        <w:t xml:space="preserve"> </w:t>
-      </w:r>
-      <w:r>
-        <w:t xml:space="preserve">olur. Yedeğiniz var mı? Yoksa fidye ödemek tek seçenek gibi görünür. 3-2-1 yedek kuralı: 3 kopya, 2 farklı medya, 1 fiziksel olarak ayrı yerde. Her hafta otomatik.”</w:t>
+        <w:t xml:space="preserve">“İşte şu an Türkiye haritası. Her saniye bir şehir yanıyor — Phishing, Ransomware, DDoS, Brute-Force, Deepfake. Sağda canlı log. USOM verisi günde 11 milyon engelleme — bu görüntü gerçeği temsil ediyor.”</w:t>
       </w:r>
     </w:p>
     <w:p>
@@ -2581,7 +2734,7 @@
         <w:t xml:space="preserve"> </w:t>
       </w:r>
       <w:r>
-        <w:t xml:space="preserve">Sayaç doğal akışında devam ediyor, paniği büyütüyor.</w:t>
+        <w:t xml:space="preserve">30 saniye saldırıları göster.</w:t>
       </w:r>
     </w:p>
     <w:p>
@@ -2592,23 +2745,13 @@
       </w:r>
     </w:p>
     <w:bookmarkEnd w:id="40"/>
-    <w:bookmarkEnd w:id="41"/>
-    <w:bookmarkStart w:id="45" w:name="bölüm-6-korunma"/>
-    <w:p>
-      <w:pPr>
-        <w:pStyle w:val="Heading2"/>
-      </w:pPr>
-      <w:r>
-        <w:t xml:space="preserve">BÖLÜM 6 · KORUNMA</w:t>
-      </w:r>
-    </w:p>
-    <w:bookmarkStart w:id="42" w:name="slayt-29-bölüm-03-başlık"/>
+    <w:bookmarkStart w:id="41" w:name="slayt-29-wi-fi-tuzağı-evil-twin-yeni"/>
     <w:p>
       <w:pPr>
         <w:pStyle w:val="Heading3"/>
       </w:pPr>
       <w:r>
-        <w:t xml:space="preserve">Slayt 29 · Bölüm 03 başlık</w:t>
+        <w:t xml:space="preserve">Slayt 29 · Wi-Fi Tuzağı · Evil Twin (YENİ)</w:t>
       </w:r>
     </w:p>
     <w:p>
@@ -2616,7 +2759,66 @@
         <w:pStyle w:val="BlockText"/>
       </w:pPr>
       <w:r>
-        <w:t xml:space="preserve">“Şimdi savunmaya geçiyoruz. Bugün, salondan çıkmadan uygulayabileceğin adımlar.”</w:t>
+        <w:t xml:space="preserve">“Kafede oturuyorsun, Wi-Fi listesini açıyorsun.</w:t>
+      </w:r>
+      <w:r>
+        <w:t xml:space="preserve"> </w:t>
+      </w:r>
+      <w:r>
+        <w:t xml:space="preserve">‘Cafe_Manisa_Free’</w:t>
+      </w:r>
+      <w:r>
+        <w:t xml:space="preserve"> </w:t>
+      </w:r>
+      <w:r>
+        <w:t xml:space="preserve">var, şifresiz, sinyal güçlü — bağlanıyorsun. Ama bu cafe değil,</w:t>
+      </w:r>
+      <w:r>
+        <w:t xml:space="preserve"> </w:t>
+      </w:r>
+      <w:r>
+        <w:rPr>
+          <w:b/>
+          <w:bCs/>
+        </w:rPr>
+        <w:t xml:space="preserve">saldırganın telefonu</w:t>
+      </w:r>
+      <w:r>
+        <w:t xml:space="preserve">. Adı kafenin adına benzer şekilde uydurulmuş — evil twin saldırısı. Bağlandığın anda tüm trafik onun ağına akıyor — Instagram giriş, banka şifre, WhatsApp oturum tokenı — hepsi saldırgana düşüyor.</w:t>
+      </w:r>
+      <w:r>
+        <w:t xml:space="preserve"> </w:t>
+      </w:r>
+      <w:r>
+        <w:rPr>
+          <w:b/>
+          <w:bCs/>
+        </w:rPr>
+        <w:t xml:space="preserve">Koruma üç adım:</w:t>
+      </w:r>
+      <w:r>
+        <w:t xml:space="preserve"> </w:t>
+      </w:r>
+      <w:r>
+        <w:t xml:space="preserve">şifresiz Wi-Fi’ya bağlanma, VPN kullan, tarayıcıda https kilidini her zaman kontrol et.”</w:t>
+      </w:r>
+    </w:p>
+    <w:p>
+      <w:pPr>
+        <w:pStyle w:val="FirstParagraph"/>
+      </w:pPr>
+      <w:r>
+        <w:rPr>
+          <w:b/>
+          <w:bCs/>
+        </w:rPr>
+        <w:t xml:space="preserve">Yapılacak:</w:t>
+      </w:r>
+      <w:r>
+        <w:t xml:space="preserve"> </w:t>
+      </w:r>
+      <w:r>
+        <w:t xml:space="preserve">3 fazlı animasyon — Wi-Fi listesi → bağlandın → kırmızı leak ekranı. Toplam ~6 sn.</w:t>
       </w:r>
     </w:p>
     <w:p>
@@ -2626,14 +2828,14 @@
         </w:pict>
       </w:r>
     </w:p>
-    <w:bookmarkEnd w:id="42"/>
-    <w:bookmarkStart w:id="43" w:name="slayt-30-5-dakikada-5-adım"/>
+    <w:bookmarkEnd w:id="41"/>
+    <w:bookmarkStart w:id="42" w:name="Xb49d19ceeabb8b3a48fdef5fddf533a150509c6"/>
     <w:p>
       <w:pPr>
         <w:pStyle w:val="Heading3"/>
       </w:pPr>
       <w:r>
-        <w:t xml:space="preserve">Slayt 30 · 5 Dakikada 5 Adım</w:t>
+        <w:t xml:space="preserve">Slayt 30 · SIM Swap · Numaranın Çalınması (YENİ)</w:t>
       </w:r>
     </w:p>
     <w:p>
@@ -2641,87 +2843,51 @@
         <w:pStyle w:val="BlockText"/>
       </w:pPr>
       <w:r>
-        <w:t xml:space="preserve">“Beş adım, beş dakika.</w:t>
-      </w:r>
-      <w:r>
-        <w:t xml:space="preserve"> </w:t>
-      </w:r>
-      <w:r>
-        <w:rPr>
-          <w:b/>
-          <w:bCs/>
-        </w:rPr>
-        <w:t xml:space="preserve">Bir:</w:t>
-      </w:r>
-      <w:r>
-        <w:t xml:space="preserve"> </w:t>
-      </w:r>
-      <w:r>
-        <w:t xml:space="preserve">Şifre yöneticisi kur — 1Password, Bitwarden veya Apple/Google parolaları, ücretsiz başla.</w:t>
-      </w:r>
-      <w:r>
-        <w:t xml:space="preserve"> </w:t>
-      </w:r>
-      <w:r>
-        <w:rPr>
-          <w:b/>
-          <w:bCs/>
-        </w:rPr>
-        <w:t xml:space="preserve">İki:</w:t>
-      </w:r>
-      <w:r>
-        <w:t xml:space="preserve"> </w:t>
-      </w:r>
-      <w:r>
-        <w:t xml:space="preserve">Banka, e-posta ve sosyal medyaya authenticator-tabanlı 2FA aç.</w:t>
-      </w:r>
-      <w:r>
-        <w:t xml:space="preserve"> </w:t>
-      </w:r>
-      <w:r>
-        <w:rPr>
-          <w:b/>
-          <w:bCs/>
-        </w:rPr>
-        <w:t xml:space="preserve">Üç:</w:t>
-      </w:r>
-      <w:r>
-        <w:t xml:space="preserve"> </w:t>
-      </w:r>
-      <w:r>
-        <w:t xml:space="preserve">Telefon ve bilgisayar güncellemelerini otomatik bırak — yamalar canını kurtarır.</w:t>
-      </w:r>
-      <w:r>
-        <w:t xml:space="preserve"> </w:t>
-      </w:r>
-      <w:r>
-        <w:rPr>
-          <w:b/>
-          <w:bCs/>
-        </w:rPr>
-        <w:t xml:space="preserve">Dört:</w:t>
-      </w:r>
-      <w:r>
-        <w:t xml:space="preserve"> </w:t>
-      </w:r>
-      <w:r>
-        <w:t xml:space="preserve">Haftada bir, ayrı bir diskte ya da bulutta yedek al — 3-2-1 kuralı.</w:t>
-      </w:r>
-      <w:r>
-        <w:t xml:space="preserve"> </w:t>
-      </w:r>
-      <w:r>
-        <w:rPr>
-          <w:b/>
-          <w:bCs/>
-        </w:rPr>
-        <w:t xml:space="preserve">Beş:</w:t>
-      </w:r>
-      <w:r>
-        <w:t xml:space="preserve"> </w:t>
-      </w:r>
-      <w:r>
-        <w:t xml:space="preserve">3 saniye dur. Linke tıklamadan, mesajı kontrol et.”</w:t>
+        <w:t xml:space="preserve">“Saldırgan operatöre gidiyor — sahte kimlikle, hatta bazen rüşvetle çalışana.</w:t>
+      </w:r>
+      <w:r>
+        <w:t xml:space="preserve"> </w:t>
+      </w:r>
+      <w:r>
+        <w:t xml:space="preserve">‘Telefonum çalındı, yeni SIM lazım.’</w:t>
+      </w:r>
+      <w:r>
+        <w:t xml:space="preserve"> </w:t>
+      </w:r>
+      <w:r>
+        <w:t xml:space="preserve">5 dakika sonra senin numaran onun telefonunda. SMS ile gelen 2FA kodları artık ona düşüyor — banka, e-posta, sosyal medya, hepsi domino düşüyor.</w:t>
+      </w:r>
+      <w:r>
+        <w:t xml:space="preserve"> </w:t>
+      </w:r>
+      <w:r>
+        <w:rPr>
+          <w:b/>
+          <w:bCs/>
+        </w:rPr>
+        <w:t xml:space="preserve">Koruma:</w:t>
+      </w:r>
+      <w:r>
+        <w:t xml:space="preserve"> </w:t>
+      </w:r>
+      <w:r>
+        <w:t xml:space="preserve">Ayarlar’dan SIM PIN aç. Operatör hesabına çağrı şifresi koy. SMS 2FA değil,</w:t>
+      </w:r>
+      <w:r>
+        <w:t xml:space="preserve"> </w:t>
+      </w:r>
+      <w:r>
+        <w:rPr>
+          <w:b/>
+          <w:bCs/>
+        </w:rPr>
+        <w:t xml:space="preserve">authenticator uygulaması</w:t>
+      </w:r>
+      <w:r>
+        <w:t xml:space="preserve"> </w:t>
+      </w:r>
+      <w:r>
+        <w:t xml:space="preserve">kullan.”</w:t>
       </w:r>
     </w:p>
     <w:p>
@@ -2731,14 +2897,14 @@
         </w:pict>
       </w:r>
     </w:p>
-    <w:bookmarkEnd w:id="43"/>
-    <w:bookmarkStart w:id="44" w:name="slayt-31-3-saniye-kuralı-cinematic"/>
+    <w:bookmarkEnd w:id="42"/>
+    <w:bookmarkStart w:id="43" w:name="slayt-31-iot-cihaz-güvenliği-yeni"/>
     <w:p>
       <w:pPr>
         <w:pStyle w:val="Heading3"/>
       </w:pPr>
       <w:r>
-        <w:t xml:space="preserve">Slayt 31 · 3 Saniye Kuralı (cinematic)</w:t>
+        <w:t xml:space="preserve">Slayt 31 · IoT Cihaz Güvenliği (YENİ)</w:t>
       </w:r>
     </w:p>
     <w:p>
@@ -2746,39 +2912,71 @@
         <w:pStyle w:val="BlockText"/>
       </w:pPr>
       <w:r>
-        <w:t xml:space="preserve">“Şimdi şu sahte SMS’e bakın. Sayaç 3-2-1 sayıyor.</w:t>
-      </w:r>
-      <w:r>
-        <w:t xml:space="preserve"> </w:t>
-      </w:r>
-      <w:r>
-        <w:rPr>
-          <w:b/>
-          <w:bCs/>
-        </w:rPr>
-        <w:t xml:space="preserve">Dur. Bak.</w:t>
-      </w:r>
-      <w:r>
-        <w:t xml:space="preserve"> </w:t>
-      </w:r>
-      <w:r>
-        <w:t xml:space="preserve">Saniye sıfırlanırken üç işaret parlıyor: kişisel numara, yanlış alan adı, aciliyet baskısı. İşte bu kadar — 3 saniye + 3 işaret = kapatılan link.</w:t>
-      </w:r>
-      <w:r>
-        <w:t xml:space="preserve"> </w:t>
-      </w:r>
-      <w:r>
-        <w:rPr>
-          <w:b/>
-          <w:bCs/>
-        </w:rPr>
-        <w:t xml:space="preserve">TIKLAMA.</w:t>
-      </w:r>
-      <w:r>
-        <w:t xml:space="preserve"> </w:t>
-      </w:r>
-      <w:r>
-        <w:t xml:space="preserve">Bu sahnedeki kırmızı damga senin yapman gereken şey.”</w:t>
+        <w:t xml:space="preserve">“Evindeki akıllı cihazlar saldırgan için açık kapı.</w:t>
+      </w:r>
+      <w:r>
+        <w:t xml:space="preserve"> </w:t>
+      </w:r>
+      <w:r>
+        <w:rPr>
+          <w:b/>
+          <w:bCs/>
+        </w:rPr>
+        <w:t xml:space="preserve">Akıllı kamera, bebek monitörü:</w:t>
+      </w:r>
+      <w:r>
+        <w:t xml:space="preserve"> </w:t>
+      </w:r>
+      <w:r>
+        <w:t xml:space="preserve">varsayılan şifre değiştirilmezse Shodan üzerinden binlerce TR kamerası canlı izlenebiliyor.</w:t>
+      </w:r>
+      <w:r>
+        <w:t xml:space="preserve"> </w:t>
+      </w:r>
+      <w:r>
+        <w:rPr>
+          <w:b/>
+          <w:bCs/>
+        </w:rPr>
+        <w:t xml:space="preserve">Akıllı asistan:</w:t>
+      </w:r>
+      <w:r>
+        <w:t xml:space="preserve"> </w:t>
+      </w:r>
+      <w:r>
+        <w:t xml:space="preserve">sürekli ses dinler, buluta gönderir — hassas konuşmaları yakınında etme.</w:t>
+      </w:r>
+      <w:r>
+        <w:t xml:space="preserve"> </w:t>
+      </w:r>
+      <w:r>
+        <w:rPr>
+          <w:b/>
+          <w:bCs/>
+        </w:rPr>
+        <w:t xml:space="preserve">Akıllı TV / saat:</w:t>
+      </w:r>
+      <w:r>
+        <w:t xml:space="preserve"> </w:t>
+      </w:r>
+      <w:r>
+        <w:t xml:space="preserve">gereksiz uygulamaları sil, mikrofon izinlerini kapat.</w:t>
+      </w:r>
+      <w:r>
+        <w:t xml:space="preserve"> </w:t>
+      </w:r>
+      <w:r>
+        <w:rPr>
+          <w:b/>
+          <w:bCs/>
+        </w:rPr>
+        <w:t xml:space="preserve">2016 Mirai botnet:</w:t>
+      </w:r>
+      <w:r>
+        <w:t xml:space="preserve"> </w:t>
+      </w:r>
+      <w:r>
+        <w:t xml:space="preserve">600.000 zayıf-şifreli IoT cihazıyla yarı interneti çökertti. Şifreni değiştir, firmware güncel olsun.”</w:t>
       </w:r>
     </w:p>
     <w:p>
@@ -2788,24 +2986,14 @@
         </w:pict>
       </w:r>
     </w:p>
-    <w:bookmarkEnd w:id="44"/>
-    <w:bookmarkEnd w:id="45"/>
-    <w:bookmarkStart w:id="48" w:name="bölüm-7-kapaniş"/>
-    <w:p>
-      <w:pPr>
-        <w:pStyle w:val="Heading2"/>
-      </w:pPr>
-      <w:r>
-        <w:t xml:space="preserve">BÖLÜM 7 · KAPANIŞ</w:t>
-      </w:r>
-    </w:p>
-    <w:bookmarkStart w:id="46" w:name="slayt-32-manifesto"/>
+    <w:bookmarkEnd w:id="43"/>
+    <w:bookmarkStart w:id="44" w:name="slayt-32-usb-donanım-tuzakları-yeni"/>
     <w:p>
       <w:pPr>
         <w:pStyle w:val="Heading3"/>
       </w:pPr>
       <w:r>
-        <w:t xml:space="preserve">Slayt 32 · Manifesto</w:t>
+        <w:t xml:space="preserve">Slayt 32 · USB / Donanım Tuzakları (YENİ)</w:t>
       </w:r>
     </w:p>
     <w:p>
@@ -2813,36 +3001,55 @@
         <w:pStyle w:val="BlockText"/>
       </w:pPr>
       <w:r>
-        <w:t xml:space="preserve">“Son söz.</w:t>
-      </w:r>
-      <w:r>
-        <w:t xml:space="preserve"> </w:t>
-      </w:r>
-      <w:r>
-        <w:rPr>
-          <w:b/>
-          <w:bCs/>
-        </w:rPr>
-        <w:t xml:space="preserve">En zayıf halka değiliz, en güçlü farkındalığız.</w:t>
-      </w:r>
-      <w:r>
-        <w:t xml:space="preserve"> </w:t>
-      </w:r>
-      <w:r>
-        <w:t xml:space="preserve">Saldırgan yazılımı geçemez — kullanıcıyı ikna eder. O kullanıcıyı bilinçli yaparsak — saldırganın en güçlü silahı elinde kalır. Burada öğrendikleriniz sizinle, ailenizle, üniversite arkadaşınızla paylaşıldığı sürece,</w:t>
-      </w:r>
-      <w:r>
-        <w:t xml:space="preserve"> </w:t>
-      </w:r>
-      <w:r>
-        <w:rPr>
-          <w:b/>
-          <w:bCs/>
-        </w:rPr>
-        <w:t xml:space="preserve">biz kazanıyoruz</w:t>
-      </w:r>
-      <w:r>
-        <w:t xml:space="preserve">.”</w:t>
+        <w:t xml:space="preserve">“Üç hardware tuzağı.</w:t>
+      </w:r>
+      <w:r>
+        <w:t xml:space="preserve"> </w:t>
+      </w:r>
+      <w:r>
+        <w:rPr>
+          <w:b/>
+          <w:bCs/>
+        </w:rPr>
+        <w:t xml:space="preserve">Yerde bulduğun USB’yi takma</w:t>
+      </w:r>
+      <w:r>
+        <w:t xml:space="preserve"> </w:t>
+      </w:r>
+      <w:r>
+        <w:t xml:space="preserve">— Rubber Ducky 3 saniyede komut çalıştırır, hesabını dışa açar. Stuxnet 2010’da nükleer santralleri böyle ele geçirdi.</w:t>
+      </w:r>
+      <w:r>
+        <w:t xml:space="preserve"> </w:t>
+      </w:r>
+      <w:r>
+        <w:rPr>
+          <w:b/>
+          <w:bCs/>
+        </w:rPr>
+        <w:t xml:space="preserve">Sahte şarj kabloları (O.MG cable):</w:t>
+      </w:r>
+      <w:r>
+        <w:t xml:space="preserve"> </w:t>
+      </w:r>
+      <w:r>
+        <w:t xml:space="preserve">görünüşte sıradan, içinde WiFi mini-bilgisayar — telefonunu klavye olarak kontrol eder.</w:t>
+      </w:r>
+      <w:r>
+        <w:t xml:space="preserve"> </w:t>
+      </w:r>
+      <w:r>
+        <w:rPr>
+          <w:b/>
+          <w:bCs/>
+        </w:rPr>
+        <w:t xml:space="preserve">Public USB charging (juice jacking):</w:t>
+      </w:r>
+      <w:r>
+        <w:t xml:space="preserve"> </w:t>
+      </w:r>
+      <w:r>
+        <w:t xml:space="preserve">havalimanı, kafe USB portlarından şarj eden porttan veri de akar. Sadece kendi adaptörünle priza tak.”</w:t>
       </w:r>
     </w:p>
     <w:p>
@@ -2852,14 +3059,14 @@
         </w:pict>
       </w:r>
     </w:p>
-    <w:bookmarkEnd w:id="46"/>
-    <w:bookmarkStart w:id="47" w:name="slayt-33-teşekkürler-qrlar"/>
+    <w:bookmarkEnd w:id="44"/>
+    <w:bookmarkStart w:id="45" w:name="X2ac43fb8ab4d250de014c4571475262605208eb"/>
     <w:p>
       <w:pPr>
         <w:pStyle w:val="Heading3"/>
       </w:pPr>
       <w:r>
-        <w:t xml:space="preserve">Slayt 33 · Teşekkürler · QR’lar</w:t>
+        <w:t xml:space="preserve">Slayt 33 · Malvertising · Sahte Reklam Tıklatma (YENİ)</w:t>
       </w:r>
     </w:p>
     <w:p>
@@ -2867,25 +3074,51 @@
         <w:pStyle w:val="BlockText"/>
       </w:pPr>
       <w:r>
-        <w:t xml:space="preserve">“Bağlantıda kalmak isterseniz — soldaki LinkedIn, ortadaki Instagram, sağdaki web sitesi. Sorularınızı her zaman dinlerim. Beni dinlediğiniz için teşekkürler — sahnenizde olmak güzeldi.”</w:t>
-      </w:r>
-    </w:p>
-    <w:p>
-      <w:pPr>
-        <w:pStyle w:val="FirstParagraph"/>
-      </w:pPr>
-      <w:r>
-        <w:rPr>
-          <w:b/>
-          <w:bCs/>
-        </w:rPr>
-        <w:t xml:space="preserve">Yapılacak:</w:t>
-      </w:r>
-      <w:r>
-        <w:t xml:space="preserve"> </w:t>
-      </w:r>
-      <w:r>
-        <w:t xml:space="preserve">Soru-cevap için 5–10 dakika ayır. Mikrofonu salona ver.</w:t>
+        <w:t xml:space="preserve">“Google’da</w:t>
+      </w:r>
+      <w:r>
+        <w:t xml:space="preserve"> </w:t>
+      </w:r>
+      <w:r>
+        <w:t xml:space="preserve">‘Photoshop bedava indir’</w:t>
+      </w:r>
+      <w:r>
+        <w:t xml:space="preserve"> </w:t>
+      </w:r>
+      <w:r>
+        <w:t xml:space="preserve">arattığında ilk sonuç</w:t>
+      </w:r>
+      <w:r>
+        <w:t xml:space="preserve"> </w:t>
+      </w:r>
+      <w:r>
+        <w:rPr>
+          <w:b/>
+          <w:bCs/>
+        </w:rPr>
+        <w:t xml:space="preserve">REKLAM</w:t>
+      </w:r>
+      <w:r>
+        <w:t xml:space="preserve"> </w:t>
+      </w:r>
+      <w:r>
+        <w:t xml:space="preserve">olabilir. Saldırgan sahte siteye ücret ödüyor, en üste çıkıyor. İndirilen dosya gerçek Photoshop gibi açılır, arkada bilgisayarına trojan kurar — RedLine, Vidar — banka şifreleri ve tarayıcı oturumları çalınır.</w:t>
+      </w:r>
+      <w:r>
+        <w:t xml:space="preserve"> </w:t>
+      </w:r>
+      <w:r>
+        <w:rPr>
+          <w:b/>
+          <w:bCs/>
+        </w:rPr>
+        <w:t xml:space="preserve">Koruma:</w:t>
+      </w:r>
+      <w:r>
+        <w:t xml:space="preserve"> </w:t>
+      </w:r>
+      <w:r>
+        <w:t xml:space="preserve">uBlock Origin · resmi siteyi her zaman elle yaz (adobe.com), arama sonucundan tıklama · indirme öncesi VirusTotal’da tara.”</w:t>
       </w:r>
     </w:p>
     <w:p>
@@ -2895,16 +3128,763 @@
         </w:pict>
       </w:r>
     </w:p>
+    <w:bookmarkEnd w:id="45"/>
+    <w:bookmarkStart w:id="46" w:name="slayt-34-qr-phishing-anket-canli"/>
+    <w:p>
+      <w:pPr>
+        <w:pStyle w:val="Heading3"/>
+      </w:pPr>
+      <w:r>
+        <w:t xml:space="preserve">Slayt 34 · QR Phishing · Anket (CANLI)</w:t>
+      </w:r>
+    </w:p>
+    <w:p>
+      <w:pPr>
+        <w:pStyle w:val="BlockText"/>
+      </w:pPr>
+      <w:r>
+        <w:t xml:space="preserve">“Sıra geldi en sevdiğim deneye. Telefonunu çıkar, QR’ı tarat.</w:t>
+      </w:r>
+      <w:r>
+        <w:t xml:space="preserve"> </w:t>
+      </w:r>
+      <w:r>
+        <w:rPr>
+          <w:b/>
+          <w:bCs/>
+        </w:rPr>
+        <w:t xml:space="preserve">‘Değerlendirme ve Çekiliş’</w:t>
+      </w:r>
+      <w:r>
+        <w:t xml:space="preserve"> </w:t>
+      </w:r>
+      <w:r>
+        <w:t xml:space="preserve">— kısa anketi doldur, sürpriz hediye çekilişine katıl. Hemen tarat.”</w:t>
+      </w:r>
+    </w:p>
+    <w:p>
+      <w:pPr>
+        <w:pStyle w:val="FirstParagraph"/>
+      </w:pPr>
+      <w:r>
+        <w:rPr>
+          <w:b/>
+          <w:bCs/>
+        </w:rPr>
+        <w:t xml:space="preserve">Yapılacak:</w:t>
+      </w:r>
+      <w:r>
+        <w:t xml:space="preserve"> </w:t>
+      </w:r>
+      <w:r>
+        <w:t xml:space="preserve">30–60 saniye bekle. Sayaç gerçek zamanlı artar.</w:t>
+      </w:r>
+      <w:r>
+        <w:t xml:space="preserve"> </w:t>
+      </w:r>
+      <w:r>
+        <w:t xml:space="preserve">“X kişi katıldı”</w:t>
+      </w:r>
+      <w:r>
+        <w:t xml:space="preserve"> </w:t>
+      </w:r>
+      <w:r>
+        <w:t xml:space="preserve">yazısını göster, sonra boşluğa bas.</w:t>
+      </w:r>
+    </w:p>
+    <w:p>
+      <w:r>
+        <w:pict>
+          <v:rect style="width:0;height:1.5pt" o:hralign="center" o:hrstd="t" o:hr="t"/>
+        </w:pict>
+      </w:r>
+    </w:p>
+    <w:bookmarkEnd w:id="46"/>
+    <w:bookmarkStart w:id="47" w:name="slayt-35-qr-phishing-reveal"/>
+    <w:p>
+      <w:pPr>
+        <w:pStyle w:val="Heading3"/>
+      </w:pPr>
+      <w:r>
+        <w:t xml:space="preserve">Slayt 35 · QR Phishing · Reveal</w:t>
+      </w:r>
+    </w:p>
+    <w:p>
+      <w:pPr>
+        <w:pStyle w:val="BlockText"/>
+      </w:pPr>
+      <w:r>
+        <w:t xml:space="preserve">“İşte sayı:</w:t>
+      </w:r>
+      <w:r>
+        <w:t xml:space="preserve"> </w:t>
+      </w:r>
+      <w:r>
+        <w:rPr>
+          <w:b/>
+          <w:bCs/>
+        </w:rPr>
+        <w:t xml:space="preserve">[X] kişi sahte bir QR’a güvendi.</w:t>
+      </w:r>
+      <w:r>
+        <w:t xml:space="preserve"> </w:t>
+      </w:r>
+      <w:r>
+        <w:t xml:space="preserve">Aslında anket falan yoktu. Tarayan herkes</w:t>
+      </w:r>
+      <w:r>
+        <w:t xml:space="preserve"> </w:t>
+      </w:r>
+      <w:r>
+        <w:t xml:space="preserve">‘VERİLERİNİZ ALINIYOR’</w:t>
+      </w:r>
+      <w:r>
+        <w:t xml:space="preserve"> </w:t>
+      </w:r>
+      <w:r>
+        <w:t xml:space="preserve">kırmızı ekranıyla karşılaştı. Demoydu, hiçbir şey çalmadık.</w:t>
+      </w:r>
+      <w:r>
+        <w:t xml:space="preserve"> </w:t>
+      </w:r>
+      <w:r>
+        <w:rPr>
+          <w:b/>
+          <w:bCs/>
+        </w:rPr>
+        <w:t xml:space="preserve">Ama gerçek bir saldırgan QR’ı taradığın an bunu yapabilirdi.</w:t>
+      </w:r>
+      <w:r>
+        <w:t xml:space="preserve"> </w:t>
+      </w:r>
+      <w:r>
+        <w:t xml:space="preserve">QR = link. Tıklamadan önce nereye gittiğini kontrol et.”</w:t>
+      </w:r>
+    </w:p>
+    <w:p>
+      <w:r>
+        <w:pict>
+          <v:rect style="width:0;height:1.5pt" o:hralign="center" o:hrstd="t" o:hr="t"/>
+        </w:pict>
+      </w:r>
+    </w:p>
     <w:bookmarkEnd w:id="47"/>
+    <w:bookmarkStart w:id="48" w:name="slayt-36-ransomware-geri-sayım"/>
+    <w:p>
+      <w:pPr>
+        <w:pStyle w:val="Heading3"/>
+      </w:pPr>
+      <w:r>
+        <w:t xml:space="preserve">Slayt 36 · Ransomware Geri Sayım</w:t>
+      </w:r>
+    </w:p>
+    <w:p>
+      <w:pPr>
+        <w:pStyle w:val="BlockText"/>
+      </w:pPr>
+      <w:r>
+        <w:t xml:space="preserve">“CryptoLock-26 fidye yazılımı — verilerinizi şifreledi. 0.05 Bitcoin ödeyin — yaklaşık 50.000 dolar. Geri sayım bittiğinde fiyat iki katı olur. Yedeğiniz var mı?</w:t>
+      </w:r>
+      <w:r>
+        <w:t xml:space="preserve"> </w:t>
+      </w:r>
+      <w:r>
+        <w:rPr>
+          <w:b/>
+          <w:bCs/>
+        </w:rPr>
+        <w:t xml:space="preserve">3-2-1 yedek kuralı:</w:t>
+      </w:r>
+      <w:r>
+        <w:t xml:space="preserve"> </w:t>
+      </w:r>
+      <w:r>
+        <w:t xml:space="preserve">3 kopya, 2 farklı medya, 1 fiziksel olarak ayrı yerde. Her hafta otomatik.”</w:t>
+      </w:r>
+    </w:p>
+    <w:p>
+      <w:r>
+        <w:pict>
+          <v:rect style="width:0;height:1.5pt" o:hralign="center" o:hrstd="t" o:hr="t"/>
+        </w:pict>
+      </w:r>
+    </w:p>
     <w:bookmarkEnd w:id="48"/>
     <w:bookmarkEnd w:id="49"/>
-    <w:bookmarkStart w:id="50" w:name="genel-ipuçları"/>
+    <w:bookmarkStart w:id="55" w:name="bölüm-6-korunma"/>
+    <w:p>
+      <w:pPr>
+        <w:pStyle w:val="Heading2"/>
+      </w:pPr>
+      <w:r>
+        <w:t xml:space="preserve">BÖLÜM 6 · KORUNMA</w:t>
+      </w:r>
+    </w:p>
+    <w:bookmarkStart w:id="50" w:name="slayt-37-bölüm-03-başlık"/>
+    <w:p>
+      <w:pPr>
+        <w:pStyle w:val="Heading3"/>
+      </w:pPr>
+      <w:r>
+        <w:t xml:space="preserve">Slayt 37 · Bölüm 03 başlık</w:t>
+      </w:r>
+    </w:p>
+    <w:p>
+      <w:pPr>
+        <w:pStyle w:val="BlockText"/>
+      </w:pPr>
+      <w:r>
+        <w:t xml:space="preserve">“Şimdi savunmaya geçiyoruz. Bugün, salondan çıkmadan uygulayabileceğin adımlar.”</w:t>
+      </w:r>
+    </w:p>
+    <w:p>
+      <w:r>
+        <w:pict>
+          <v:rect style="width:0;height:1.5pt" o:hralign="center" o:hrstd="t" o:hr="t"/>
+        </w:pict>
+      </w:r>
+    </w:p>
+    <w:bookmarkEnd w:id="50"/>
+    <w:bookmarkStart w:id="51" w:name="slayt-38-5-dakikada-5-adım"/>
+    <w:p>
+      <w:pPr>
+        <w:pStyle w:val="Heading3"/>
+      </w:pPr>
+      <w:r>
+        <w:t xml:space="preserve">Slayt 38 · 5 Dakikada 5 Adım</w:t>
+      </w:r>
+    </w:p>
+    <w:p>
+      <w:pPr>
+        <w:pStyle w:val="BlockText"/>
+      </w:pPr>
+      <w:r>
+        <w:t xml:space="preserve">“Beş adım, beş dakika.</w:t>
+      </w:r>
+      <w:r>
+        <w:t xml:space="preserve"> </w:t>
+      </w:r>
+      <w:r>
+        <w:rPr>
+          <w:b/>
+          <w:bCs/>
+        </w:rPr>
+        <w:t xml:space="preserve">Bir:</w:t>
+      </w:r>
+      <w:r>
+        <w:t xml:space="preserve"> </w:t>
+      </w:r>
+      <w:r>
+        <w:t xml:space="preserve">Şifre yöneticisi kur — 1Password, Bitwarden veya Apple/Google parolaları.</w:t>
+      </w:r>
+      <w:r>
+        <w:t xml:space="preserve"> </w:t>
+      </w:r>
+      <w:r>
+        <w:rPr>
+          <w:b/>
+          <w:bCs/>
+        </w:rPr>
+        <w:t xml:space="preserve">İki:</w:t>
+      </w:r>
+      <w:r>
+        <w:t xml:space="preserve"> </w:t>
+      </w:r>
+      <w:r>
+        <w:t xml:space="preserve">Banka, e-posta ve sosyal medyaya authenticator-tabanlı 2FA aç.</w:t>
+      </w:r>
+      <w:r>
+        <w:t xml:space="preserve"> </w:t>
+      </w:r>
+      <w:r>
+        <w:rPr>
+          <w:b/>
+          <w:bCs/>
+        </w:rPr>
+        <w:t xml:space="preserve">Üç:</w:t>
+      </w:r>
+      <w:r>
+        <w:t xml:space="preserve"> </w:t>
+      </w:r>
+      <w:r>
+        <w:t xml:space="preserve">Telefon ve bilgisayar güncellemelerini otomatik bırak.</w:t>
+      </w:r>
+      <w:r>
+        <w:t xml:space="preserve"> </w:t>
+      </w:r>
+      <w:r>
+        <w:rPr>
+          <w:b/>
+          <w:bCs/>
+        </w:rPr>
+        <w:t xml:space="preserve">Dört:</w:t>
+      </w:r>
+      <w:r>
+        <w:t xml:space="preserve"> </w:t>
+      </w:r>
+      <w:r>
+        <w:t xml:space="preserve">Haftada bir yedek al — 3-2-1 kuralı.</w:t>
+      </w:r>
+      <w:r>
+        <w:t xml:space="preserve"> </w:t>
+      </w:r>
+      <w:r>
+        <w:rPr>
+          <w:b/>
+          <w:bCs/>
+        </w:rPr>
+        <w:t xml:space="preserve">Beş:</w:t>
+      </w:r>
+      <w:r>
+        <w:t xml:space="preserve"> </w:t>
+      </w:r>
+      <w:r>
+        <w:t xml:space="preserve">3 saniye dur. Linke tıklamadan, mesajı kontrol et.”</w:t>
+      </w:r>
+    </w:p>
+    <w:p>
+      <w:r>
+        <w:pict>
+          <v:rect style="width:0;height:1.5pt" o:hralign="center" o:hrstd="t" o:hr="t"/>
+        </w:pict>
+      </w:r>
+    </w:p>
+    <w:bookmarkEnd w:id="51"/>
+    <w:bookmarkStart w:id="52" w:name="slayt-39-3-saniye-kuralı-cinematic"/>
+    <w:p>
+      <w:pPr>
+        <w:pStyle w:val="Heading3"/>
+      </w:pPr>
+      <w:r>
+        <w:t xml:space="preserve">Slayt 39 · 3 Saniye Kuralı (cinematic)</w:t>
+      </w:r>
+    </w:p>
+    <w:p>
+      <w:pPr>
+        <w:pStyle w:val="BlockText"/>
+      </w:pPr>
+      <w:r>
+        <w:t xml:space="preserve">“Şu sahte SMS’e bakın. Sayaç 3-2-1 sayıyor.</w:t>
+      </w:r>
+      <w:r>
+        <w:t xml:space="preserve"> </w:t>
+      </w:r>
+      <w:r>
+        <w:rPr>
+          <w:b/>
+          <w:bCs/>
+        </w:rPr>
+        <w:t xml:space="preserve">Dur. Bak.</w:t>
+      </w:r>
+      <w:r>
+        <w:t xml:space="preserve"> </w:t>
+      </w:r>
+      <w:r>
+        <w:t xml:space="preserve">Saniye sıfırlanırken üç işaret parlıyor: kişisel numara, yanlış alan adı, aciliyet baskısı. 3 saniye + 3 işaret = kapatılan link.</w:t>
+      </w:r>
+      <w:r>
+        <w:t xml:space="preserve"> </w:t>
+      </w:r>
+      <w:r>
+        <w:rPr>
+          <w:b/>
+          <w:bCs/>
+        </w:rPr>
+        <w:t xml:space="preserve">TIKLAMA.</w:t>
+      </w:r>
+      <w:r>
+        <w:t xml:space="preserve">”</w:t>
+      </w:r>
+    </w:p>
+    <w:p>
+      <w:r>
+        <w:pict>
+          <v:rect style="width:0;height:1.5pt" o:hralign="center" o:hrstd="t" o:hr="t"/>
+        </w:pict>
+      </w:r>
+    </w:p>
+    <w:bookmarkEnd w:id="52"/>
+    <w:bookmarkStart w:id="53" w:name="Xa6d3fec2e0d46ae235183cfbdf0628a05a751fe"/>
+    <w:p>
+      <w:pPr>
+        <w:pStyle w:val="Heading3"/>
+      </w:pPr>
+      <w:r>
+        <w:t xml:space="preserve">Slayt 40 ·</w:t>
+      </w:r>
+      <w:r>
+        <w:t xml:space="preserve"> </w:t>
+      </w:r>
+      <w:r>
+        <w:t xml:space="preserve">“Hesabım Çalındı — Şimdi Ne Yapacağım?”</w:t>
+      </w:r>
+      <w:r>
+        <w:t xml:space="preserve"> </w:t>
+      </w:r>
+      <w:r>
+        <w:t xml:space="preserve">(YENİ)</w:t>
+      </w:r>
+    </w:p>
+    <w:p>
+      <w:pPr>
+        <w:pStyle w:val="BlockText"/>
+      </w:pPr>
+      <w:r>
+        <w:t xml:space="preserve">“Bu slaytı telefonunuza kaydetmenizi öneririm — başınıza gelirse hayat kurtarır.</w:t>
+      </w:r>
+      <w:r>
+        <w:t xml:space="preserve"> </w:t>
+      </w:r>
+      <w:r>
+        <w:rPr>
+          <w:b/>
+          <w:bCs/>
+        </w:rPr>
+        <w:t xml:space="preserve">1. Hala erişiminiz varsa:</w:t>
+      </w:r>
+      <w:r>
+        <w:t xml:space="preserve"> </w:t>
+      </w:r>
+      <w:r>
+        <w:t xml:space="preserve">şifreyi DEĞİŞTİR, tüm aktif oturumları kapat (Settings → Security → Sessions).</w:t>
+      </w:r>
+      <w:r>
+        <w:t xml:space="preserve"> </w:t>
+      </w:r>
+      <w:r>
+        <w:rPr>
+          <w:b/>
+          <w:bCs/>
+        </w:rPr>
+        <w:t xml:space="preserve">2. 2FA’yı aç</w:t>
+      </w:r>
+      <w:r>
+        <w:t xml:space="preserve"> </w:t>
+      </w:r>
+      <w:r>
+        <w:t xml:space="preserve">(authenticator app), kurtarma kodlarını yaz, kurtarma e-postası/telefonu kontrol et — saldırgan değiştirmiş olabilir.</w:t>
+      </w:r>
+      <w:r>
+        <w:t xml:space="preserve"> </w:t>
+      </w:r>
+      <w:r>
+        <w:rPr>
+          <w:b/>
+          <w:bCs/>
+        </w:rPr>
+        <w:t xml:space="preserve">3. Banka/kart bağlıysa:</w:t>
+      </w:r>
+      <w:r>
+        <w:t xml:space="preserve"> </w:t>
+      </w:r>
+      <w:r>
+        <w:t xml:space="preserve">bankayı 24/7 hattan ARA, işlem itirazı aç, kartı blokeye al. </w:t>
+      </w:r>
+      <w:r>
+        <w:rPr>
+          <w:b/>
+          <w:bCs/>
+        </w:rPr>
+        <w:t xml:space="preserve">4. Domino önle:</w:t>
+      </w:r>
+      <w:r>
+        <w:t xml:space="preserve"> </w:t>
+      </w:r>
+      <w:r>
+        <w:t xml:space="preserve">aynı şifreyi kullandığınız diğer hesapları acilen değiştirin — e-posta, sosyal medya, eDevlet.</w:t>
+      </w:r>
+      <w:r>
+        <w:t xml:space="preserve"> </w:t>
+      </w:r>
+      <w:r>
+        <w:rPr>
+          <w:b/>
+          <w:bCs/>
+        </w:rPr>
+        <w:t xml:space="preserve">5. İhbar:</w:t>
+      </w:r>
+      <w:r>
+        <w:t xml:space="preserve"> </w:t>
+      </w:r>
+      <w:r>
+        <w:t xml:space="preserve">USOM (usom.gov.tr), KVKK (eDevlet üzerinden), Cumhuriyet Başsavcılığı suç duyurusu, BTK 444 1 588.”</w:t>
+      </w:r>
+    </w:p>
+    <w:p>
+      <w:pPr>
+        <w:pStyle w:val="FirstParagraph"/>
+      </w:pPr>
+      <w:r>
+        <w:rPr>
+          <w:b/>
+          <w:bCs/>
+        </w:rPr>
+        <w:t xml:space="preserve">Yapılacak:</w:t>
+      </w:r>
+      <w:r>
+        <w:t xml:space="preserve"> </w:t>
+      </w:r>
+      <w:r>
+        <w:t xml:space="preserve">Audience telefonlarına bu listeyi yazmak için 30 saniye iste.</w:t>
+      </w:r>
+      <w:r>
+        <w:t xml:space="preserve"> </w:t>
+      </w:r>
+      <w:r>
+        <w:t xml:space="preserve">“Fotoğraf çekin”</w:t>
+      </w:r>
+      <w:r>
+        <w:t xml:space="preserve"> </w:t>
+      </w:r>
+      <w:r>
+        <w:t xml:space="preserve">de.</w:t>
+      </w:r>
+    </w:p>
+    <w:p>
+      <w:r>
+        <w:pict>
+          <v:rect style="width:0;height:1.5pt" o:hralign="center" o:hrstd="t" o:hr="t"/>
+        </w:pict>
+      </w:r>
+    </w:p>
+    <w:bookmarkEnd w:id="53"/>
+    <w:bookmarkStart w:id="54" w:name="Xd639e373080810eb7c4cd6cfd965394f2bb58e4"/>
+    <w:p>
+      <w:pPr>
+        <w:pStyle w:val="Heading3"/>
+      </w:pPr>
+      <w:r>
+        <w:t xml:space="preserve">Slayt 41 · Sen Ne Yaparsın? (Karar Senaryosu) (YENİ)</w:t>
+      </w:r>
+    </w:p>
+    <w:p>
+      <w:pPr>
+        <w:pStyle w:val="BlockText"/>
+      </w:pPr>
+      <w:r>
+        <w:t xml:space="preserve">“Son test. Instagram’dan gelen mail:</w:t>
+      </w:r>
+      <w:r>
+        <w:t xml:space="preserve"> </w:t>
+      </w:r>
+      <w:r>
+        <w:t xml:space="preserve">‘Hesabınızda şüpheli giriş, 1 saat içinde doğrulamazsanız hesap kalıcı silinecek.’</w:t>
+      </w:r>
+      <w:r>
+        <w:t xml:space="preserve"> </w:t>
+      </w:r>
+      <w:r>
+        <w:t xml:space="preserve">Sonunda</w:t>
+      </w:r>
+      <w:r>
+        <w:t xml:space="preserve"> </w:t>
+      </w:r>
+      <w:r>
+        <w:t xml:space="preserve">‘Hesabımı Doğrula’</w:t>
+      </w:r>
+      <w:r>
+        <w:t xml:space="preserve"> </w:t>
+      </w:r>
+      <w:r>
+        <w:t xml:space="preserve">butonu. Sen ne yaparsın? Üç seçenek. 4 saniyen var, kararını ver. … Tamam, doğru cevap</w:t>
+      </w:r>
+      <w:r>
+        <w:t xml:space="preserve"> </w:t>
+      </w:r>
+      <w:r>
+        <w:rPr>
+          <w:b/>
+          <w:bCs/>
+        </w:rPr>
+        <w:t xml:space="preserve">B</w:t>
+      </w:r>
+      <w:r>
+        <w:t xml:space="preserve">: linke tıklamadan Instagram uygulamasından kontrol ederim.</w:t>
+      </w:r>
+      <w:r>
+        <w:t xml:space="preserve"> </w:t>
+      </w:r>
+      <w:r>
+        <w:rPr>
+          <w:b/>
+          <w:bCs/>
+        </w:rPr>
+        <w:t xml:space="preserve">A</w:t>
+      </w:r>
+      <w:r>
+        <w:t xml:space="preserve"> </w:t>
+      </w:r>
+      <w:r>
+        <w:t xml:space="preserve">yanlış — aciliyet baskısına kapılıyorsun.</w:t>
+      </w:r>
+      <w:r>
+        <w:t xml:space="preserve"> </w:t>
+      </w:r>
+      <w:r>
+        <w:rPr>
+          <w:b/>
+          <w:bCs/>
+        </w:rPr>
+        <w:t xml:space="preserve">C</w:t>
+      </w:r>
+      <w:r>
+        <w:t xml:space="preserve"> </w:t>
+      </w:r>
+      <w:r>
+        <w:t xml:space="preserve">yanlış — linke tıklamak bile zararlı. Doğru kanal her zaman uygulama / resmi web sitesi, mail içindeki link değil.”</w:t>
+      </w:r>
+    </w:p>
+    <w:p>
+      <w:pPr>
+        <w:pStyle w:val="FirstParagraph"/>
+      </w:pPr>
+      <w:r>
+        <w:rPr>
+          <w:b/>
+          <w:bCs/>
+        </w:rPr>
+        <w:t xml:space="preserve">Yapılacak:</w:t>
+      </w:r>
+      <w:r>
+        <w:t xml:space="preserve"> </w:t>
+      </w:r>
+      <w:r>
+        <w:t xml:space="preserve">Audience’a 4 sn düşünmesi için sus. Sonra reveal’i konuş.</w:t>
+      </w:r>
+    </w:p>
+    <w:p>
+      <w:r>
+        <w:pict>
+          <v:rect style="width:0;height:1.5pt" o:hralign="center" o:hrstd="t" o:hr="t"/>
+        </w:pict>
+      </w:r>
+    </w:p>
+    <w:bookmarkEnd w:id="54"/>
+    <w:bookmarkEnd w:id="55"/>
+    <w:bookmarkStart w:id="58" w:name="bölüm-7-kapaniş"/>
+    <w:p>
+      <w:pPr>
+        <w:pStyle w:val="Heading2"/>
+      </w:pPr>
+      <w:r>
+        <w:t xml:space="preserve">BÖLÜM 7 · KAPANIŞ</w:t>
+      </w:r>
+    </w:p>
+    <w:bookmarkStart w:id="56" w:name="slayt-42-manifesto"/>
+    <w:p>
+      <w:pPr>
+        <w:pStyle w:val="Heading3"/>
+      </w:pPr>
+      <w:r>
+        <w:t xml:space="preserve">Slayt 42 · Manifesto</w:t>
+      </w:r>
+    </w:p>
+    <w:p>
+      <w:pPr>
+        <w:pStyle w:val="BlockText"/>
+      </w:pPr>
+      <w:r>
+        <w:t xml:space="preserve">“Son söz.</w:t>
+      </w:r>
+      <w:r>
+        <w:t xml:space="preserve"> </w:t>
+      </w:r>
+      <w:r>
+        <w:rPr>
+          <w:b/>
+          <w:bCs/>
+        </w:rPr>
+        <w:t xml:space="preserve">En zayıf halka değiliz, en güçlü farkındalığız.</w:t>
+      </w:r>
+      <w:r>
+        <w:t xml:space="preserve"> </w:t>
+      </w:r>
+      <w:r>
+        <w:t xml:space="preserve">Saldırgan yazılımı geçemez — kullanıcıyı ikna eder. O kullanıcıyı bilinçli yaparsak — saldırganın en güçlü silahı elinde kalır. Burada öğrendikleriniz sizinle, ailenizle, üniversite arkadaşınızla paylaşıldığı sürece,</w:t>
+      </w:r>
+      <w:r>
+        <w:t xml:space="preserve"> </w:t>
+      </w:r>
+      <w:r>
+        <w:rPr>
+          <w:b/>
+          <w:bCs/>
+        </w:rPr>
+        <w:t xml:space="preserve">biz kazanıyoruz</w:t>
+      </w:r>
+      <w:r>
+        <w:t xml:space="preserve">.”</w:t>
+      </w:r>
+    </w:p>
+    <w:p>
+      <w:r>
+        <w:pict>
+          <v:rect style="width:0;height:1.5pt" o:hralign="center" o:hrstd="t" o:hr="t"/>
+        </w:pict>
+      </w:r>
+    </w:p>
+    <w:bookmarkEnd w:id="56"/>
+    <w:bookmarkStart w:id="57" w:name="slayt-43-teşekkürler-qrlar"/>
+    <w:p>
+      <w:pPr>
+        <w:pStyle w:val="Heading3"/>
+      </w:pPr>
+      <w:r>
+        <w:t xml:space="preserve">Slayt 43 · Teşekkürler · QR’lar</w:t>
+      </w:r>
+    </w:p>
+    <w:p>
+      <w:pPr>
+        <w:pStyle w:val="BlockText"/>
+      </w:pPr>
+      <w:r>
+        <w:t xml:space="preserve">“Bağlantıda kalmak isterseniz — soldaki LinkedIn, ortadaki Instagram, sağdaki web sitesi. Sorularınızı her zaman dinlerim. Beni dinlediğiniz için teşekkürler — sahnenizde olmak güzeldi.”</w:t>
+      </w:r>
+    </w:p>
+    <w:p>
+      <w:pPr>
+        <w:pStyle w:val="FirstParagraph"/>
+      </w:pPr>
+      <w:r>
+        <w:rPr>
+          <w:b/>
+          <w:bCs/>
+        </w:rPr>
+        <w:t xml:space="preserve">Yapılacak:</w:t>
+      </w:r>
+      <w:r>
+        <w:t xml:space="preserve"> </w:t>
+      </w:r>
+      <w:r>
+        <w:t xml:space="preserve">Soru-cevap için 5–10 dakika ayır. Mikrofonu salona ver.</w:t>
+      </w:r>
+    </w:p>
+    <w:p>
+      <w:r>
+        <w:pict>
+          <v:rect style="width:0;height:1.5pt" o:hralign="center" o:hrstd="t" o:hr="t"/>
+        </w:pict>
+      </w:r>
+    </w:p>
+    <w:bookmarkEnd w:id="57"/>
+    <w:bookmarkEnd w:id="58"/>
+    <w:bookmarkEnd w:id="59"/>
+    <w:bookmarkStart w:id="63" w:name="genel-ipuçları"/>
     <w:p>
       <w:pPr>
         <w:pStyle w:val="Heading1"/>
       </w:pPr>
       <w:r>
         <w:t xml:space="preserve">Genel İpuçları</w:t>
+      </w:r>
+    </w:p>
+    <w:bookmarkStart w:id="60" w:name="tempo-yönetimi"/>
+    <w:p>
+      <w:pPr>
+        <w:pStyle w:val="Heading2"/>
+      </w:pPr>
+      <w:r>
+        <w:t xml:space="preserve">Tempo Yönetimi</w:t>
       </w:r>
     </w:p>
     <w:p>
@@ -2920,13 +3900,13 @@
           <w:b/>
           <w:bCs/>
         </w:rPr>
-        <w:t xml:space="preserve">Tempoya dikkat:</w:t>
-      </w:r>
-      <w:r>
-        <w:t xml:space="preserve"> </w:t>
-      </w:r>
-      <w:r>
-        <w:t xml:space="preserve">Otomatik açılan slaytlar 1.5–2.5 saniye aralıkla parça parça açılır. Erken konuşma — slayt yetişene kadar bekle, sonra söyle.</w:t>
+        <w:t xml:space="preserve">Otomatik açılan slaytlar</w:t>
+      </w:r>
+      <w:r>
+        <w:t xml:space="preserve"> </w:t>
+      </w:r>
+      <w:r>
+        <w:t xml:space="preserve">(phishing-anatomy, journal-recognition, decision-scenario, ai-phishing) 1.5–4 saniye aralıkla parça parça açılır. Erken konuşma — slayt yetişene kadar bekle, sonra söyle.</w:t>
       </w:r>
     </w:p>
     <w:p>
@@ -2948,7 +3928,7 @@
         <w:t xml:space="preserve"> </w:t>
       </w:r>
       <w:r>
-        <w:t xml:space="preserve">Slayt 11 (canlı şifre), 26-27 (QR phishing). Bu ikisinde audience’a 30-60 saniye bırak. Acele ettirme.</w:t>
+        <w:t xml:space="preserve">Slayt 13 (canlı şifre), 34–35 (QR phishing). Bu ikisinde audience’a 30–60 saniye bırak. Acele ettirme.</w:t>
       </w:r>
     </w:p>
     <w:p>
@@ -2970,7 +3950,17 @@
         <w:t xml:space="preserve"> </w:t>
       </w:r>
       <w:r>
-        <w:t xml:space="preserve">Hedef 35-40 dk + 5-10 dk Q&amp;A. Hızlı geçen bölüm: 4-5-7 (sayılar). Yavaş geçen: 16-17 (animasyonlar otomatik).</w:t>
+        <w:t xml:space="preserve">Hedef 45–55 dk + 5–10 dk Q&amp;A. Hızlı geçen bölüm: 4–5–7 (sayılar). Yavaş geçen: 19–20 (animasyon sim’leri).</w:t>
+      </w:r>
+    </w:p>
+    <w:bookmarkEnd w:id="60"/>
+    <w:bookmarkStart w:id="61" w:name="mimikler-ve-salon-ilişkisi"/>
+    <w:p>
+      <w:pPr>
+        <w:pStyle w:val="Heading2"/>
+      </w:pPr>
+      <w:r>
+        <w:t xml:space="preserve">Mimikler ve Salon İlişkisi</w:t>
       </w:r>
     </w:p>
     <w:p>
@@ -2978,21 +3968,11 @@
         <w:pStyle w:val="Compact"/>
         <w:numPr>
           <w:ilvl w:val="0"/>
-          <w:numId w:val="1002"/>
+          <w:numId w:val="1003"/>
         </w:numPr>
       </w:pPr>
       <w:r>
-        <w:rPr>
-          <w:b/>
-          <w:bCs/>
-        </w:rPr>
-        <w:t xml:space="preserve">Mimikler:</w:t>
-      </w:r>
-      <w:r>
-        <w:t xml:space="preserve"> </w:t>
-      </w:r>
-      <w:r>
-        <w:t xml:space="preserve">Slayt 9 ve 11’de audience’a doğrudan bak — bu içerik onları çok rahatsız edecek, yüzlerini izle, bir-iki şaka yap.</w:t>
+        <w:t xml:space="preserve">Slayt 11 ve 13’te audience’a doğrudan bak — bu içerik onları çok rahatsız edecek, yüzlerini izle, bir-iki şaka yap.</w:t>
       </w:r>
     </w:p>
     <w:p>
@@ -3000,51 +3980,49 @@
         <w:pStyle w:val="Compact"/>
         <w:numPr>
           <w:ilvl w:val="0"/>
-          <w:numId w:val="1002"/>
+          <w:numId w:val="1003"/>
         </w:numPr>
       </w:pPr>
       <w:r>
-        <w:rPr>
-          <w:b/>
-          <w:bCs/>
-        </w:rPr>
-        <w:t xml:space="preserve">Soru-Cevap sık gelen sorular:</w:t>
+        <w:t xml:space="preserve">Slayt 9 (quiz) ve 41 (karar) audience’ı düşünmeye zorlar — 4 sn beklerken sus, kıvranmalarına izin ver.</w:t>
       </w:r>
     </w:p>
     <w:p>
       <w:pPr>
         <w:pStyle w:val="Compact"/>
         <w:numPr>
-          <w:ilvl w:val="1"/>
+          <w:ilvl w:val="0"/>
           <w:numId w:val="1003"/>
         </w:numPr>
       </w:pPr>
       <w:r>
-        <w:t xml:space="preserve">“Authenticator hangi uygulama?”</w:t>
-      </w:r>
-      <w:r>
-        <w:t xml:space="preserve"> </w:t>
-      </w:r>
-      <w:r>
-        <w:t xml:space="preserve">→</w:t>
-      </w:r>
-      <w:r>
-        <w:t xml:space="preserve"> </w:t>
-      </w:r>
-      <w:r>
-        <w:t xml:space="preserve">“Google Authenticator, Microsoft Authenticator, Authy — üçü de iyi, hiç biri SMS değil.”</w:t>
+        <w:t xml:space="preserve">Slayt 18 (crypto) Türkiye’de duygusal bir mesele — Thodex mağdurlarına saygılı konuş.</w:t>
+      </w:r>
+    </w:p>
+    <w:bookmarkEnd w:id="61"/>
+    <w:bookmarkStart w:id="62" w:name="soru-cevap-sık-sorulanlar"/>
+    <w:p>
+      <w:pPr>
+        <w:pStyle w:val="Heading2"/>
+      </w:pPr>
+      <w:r>
+        <w:t xml:space="preserve">Soru-Cevap Sık Sorulanlar</w:t>
       </w:r>
     </w:p>
     <w:p>
       <w:pPr>
         <w:pStyle w:val="Compact"/>
         <w:numPr>
-          <w:ilvl w:val="1"/>
-          <w:numId w:val="1003"/>
+          <w:ilvl w:val="0"/>
+          <w:numId w:val="1004"/>
         </w:numPr>
       </w:pPr>
       <w:r>
-        <w:t xml:space="preserve">“Şifre yöneticisi güvenli mi?”</w:t>
+        <w:rPr>
+          <w:b/>
+          <w:bCs/>
+        </w:rPr>
+        <w:t xml:space="preserve">“Authenticator hangi uygulama?”</w:t>
       </w:r>
       <w:r>
         <w:t xml:space="preserve"> </w:t>
@@ -3056,18 +4034,50 @@
         <w:t xml:space="preserve"> </w:t>
       </w:r>
       <w:r>
-        <w:t xml:space="preserve">“Master parolayı sen tutuyorsun, dosyalar şifreli. Kullanmadığında kayıp daha büyük.”</w:t>
+        <w:t xml:space="preserve">“Google Authenticator, Microsoft Authenticator, Authy — üçü de iyi, hiç biri SMS değil.”</w:t>
       </w:r>
     </w:p>
     <w:p>
       <w:pPr>
         <w:pStyle w:val="Compact"/>
         <w:numPr>
-          <w:ilvl w:val="1"/>
-          <w:numId w:val="1003"/>
+          <w:ilvl w:val="0"/>
+          <w:numId w:val="1004"/>
         </w:numPr>
       </w:pPr>
       <w:r>
+        <w:rPr>
+          <w:b/>
+          <w:bCs/>
+        </w:rPr>
+        <w:t xml:space="preserve">“Şifre yöneticisi güvenli mi?”</w:t>
+      </w:r>
+      <w:r>
+        <w:t xml:space="preserve"> </w:t>
+      </w:r>
+      <w:r>
+        <w:t xml:space="preserve">→</w:t>
+      </w:r>
+      <w:r>
+        <w:t xml:space="preserve"> </w:t>
+      </w:r>
+      <w:r>
+        <w:t xml:space="preserve">“Master parolayı sen tutuyorsun, dosyalar şifreli. Kullanmadığında kayıp daha büyük.”</w:t>
+      </w:r>
+    </w:p>
+    <w:p>
+      <w:pPr>
+        <w:pStyle w:val="Compact"/>
+        <w:numPr>
+          <w:ilvl w:val="0"/>
+          <w:numId w:val="1004"/>
+        </w:numPr>
+      </w:pPr>
+      <w:r>
+        <w:rPr>
+          <w:b/>
+          <w:bCs/>
+        </w:rPr>
         <w:t xml:space="preserve">“Deepfake nasıl anlarım?”</w:t>
       </w:r>
       <w:r>
@@ -3080,7 +4090,7 @@
         <w:t xml:space="preserve"> </w:t>
       </w:r>
       <w:r>
-        <w:t xml:space="preserve">“Üç ipucu (slayt 24). Şüphelendiğin an: telefonu kapat,</w:t>
+        <w:t xml:space="preserve">“Üç ipucu (slayt 27). Şüphelendiğin an: telefonu kapat,</w:t>
       </w:r>
       <w:r>
         <w:t xml:space="preserve"> </w:t>
@@ -3097,6 +4107,74 @@
       </w:r>
       <w:r>
         <w:t xml:space="preserve">geri ara.”</w:t>
+      </w:r>
+    </w:p>
+    <w:p>
+      <w:pPr>
+        <w:pStyle w:val="Compact"/>
+        <w:numPr>
+          <w:ilvl w:val="0"/>
+          <w:numId w:val="1004"/>
+        </w:numPr>
+      </w:pPr>
+      <w:r>
+        <w:rPr>
+          <w:b/>
+          <w:bCs/>
+        </w:rPr>
+        <w:t xml:space="preserve">“VPN şart mı?”</w:t>
+      </w:r>
+      <w:r>
+        <w:t xml:space="preserve"> </w:t>
+      </w:r>
+      <w:r>
+        <w:t xml:space="preserve">→</w:t>
+      </w:r>
+      <w:r>
+        <w:t xml:space="preserve"> </w:t>
+      </w:r>
+      <w:r>
+        <w:t xml:space="preserve">“Halka açık Wi-Fi’da evet. Evdeyken artı bir kat.”</w:t>
+      </w:r>
+    </w:p>
+    <w:p>
+      <w:pPr>
+        <w:pStyle w:val="Compact"/>
+        <w:numPr>
+          <w:ilvl w:val="0"/>
+          <w:numId w:val="1004"/>
+        </w:numPr>
+      </w:pPr>
+      <w:r>
+        <w:rPr>
+          <w:b/>
+          <w:bCs/>
+        </w:rPr>
+        <w:t xml:space="preserve">“Hangi VPN?”</w:t>
+      </w:r>
+      <w:r>
+        <w:t xml:space="preserve"> </w:t>
+      </w:r>
+      <w:r>
+        <w:t xml:space="preserve">→</w:t>
+      </w:r>
+      <w:r>
+        <w:t xml:space="preserve"> </w:t>
+      </w:r>
+      <w:r>
+        <w:t xml:space="preserve">“ProtonVPN (ücretsiz iyi), Mullvad (anonim ödeme), NordVPN (yaygın). Bedava</w:t>
+      </w:r>
+      <w:r>
+        <w:t xml:space="preserve"> </w:t>
+      </w:r>
+      <w:r>
+        <w:t xml:space="preserve">‘free VPN’</w:t>
+      </w:r>
+      <w:r>
+        <w:t xml:space="preserve"> </w:t>
+      </w:r>
+      <w:r>
+        <w:t xml:space="preserve">uygulamalarına dikkat — kendileri saldırgan olabilir.”</w:t>
       </w:r>
     </w:p>
     <w:p>
@@ -3115,10 +4193,11 @@
           <w:i/>
           <w:iCs/>
         </w:rPr>
-        <w:t xml:space="preserve">Notlar: Sunum 2026-05-12’de hazırlandı. Tüm rakamlar doğrulanmış kaynaklara dayanır (USOM, t24.com.tr, Cumhuriyet, Buffalo Üniversitesi, AA). Slayt sayısı veya akışı değişirse buradaki numaralandırma da güncellenmelidir.</w:t>
-      </w:r>
-    </w:p>
-    <w:bookmarkEnd w:id="50"/>
+        <w:t xml:space="preserve">Notlar: Sunum 2026-05-12’de hazırlandı. Tüm rakamlar doğrulanmış kaynaklara dayanır (USOM, t24.com.tr, Cumhuriyet, Buffalo Üniversitesi, AA). 43 slayt — slayt sayısı veya akışı değişirse buradaki numaralandırma da güncellenmelidir.</w:t>
+      </w:r>
+    </w:p>
+    <w:bookmarkEnd w:id="62"/>
+    <w:bookmarkEnd w:id="63"/>
     <w:sectPr>
       <w:footnotePr>
         <w:numRestart w:val="eachSect"/>
@@ -3456,6 +4535,9 @@
   <w:num w:numId="1003">
     <w:abstractNumId w:val="991"/>
   </w:num>
+  <w:num w:numId="1004">
+    <w:abstractNumId w:val="991"/>
+  </w:num>
 </w:numbering>
 </file>
 
@@ -3467,7 +4549,7 @@
         <w:rFonts w:asciiTheme="minorHAnsi" w:cstheme="minorBidi" w:eastAsiaTheme="minorEastAsia" w:hAnsiTheme="minorHAnsi"/>
         <w:sz w:val="24"/>
         <w:szCs w:val="24"/>
-        <w:lang w:bidi="ar-SA" w:eastAsia="zh-CN" w:val="tr-TR"/>
+        <w:lang w:bidi="ar-SA" w:eastAsia="zh-CN" w:val="en-US"/>
       </w:rPr>
     </w:rPrDefault>
     <w:pPrDefault>

</xml_diff>